<commit_message>
LAB_02 is completed - - Normalizing, imputation, binning, encoding, undersampling, oversampling exercises
</commit_message>
<xml_diff>
--- a/LAB_01/LAB1.docx
+++ b/LAB_01/LAB1.docx
@@ -1,6 +1,6 @@
 
 <file path=word/document.xml><?xml version="1.0" encoding="utf-8"?>
-<w:document xmlns:wpc="http://schemas.microsoft.com/office/word/2010/wordprocessingCanvas" xmlns:cx="http://schemas.microsoft.com/office/drawing/2014/chartex" xmlns:cx1="http://schemas.microsoft.com/office/drawing/2015/9/8/chartex" xmlns:cx2="http://schemas.microsoft.com/office/drawing/2015/10/21/chartex" xmlns:cx3="http://schemas.microsoft.com/office/drawing/2016/5/9/chartex" xmlns:cx4="http://schemas.microsoft.com/office/drawing/2016/5/10/chartex" xmlns:cx5="http://schemas.microsoft.com/office/drawing/2016/5/11/chartex" xmlns:cx6="http://schemas.microsoft.com/office/drawing/2016/5/12/chartex" xmlns:cx7="http://schemas.microsoft.com/office/drawing/2016/5/13/chartex" xmlns:cx8="http://schemas.microsoft.com/office/drawing/2016/5/14/chartex" xmlns:mc="http://schemas.openxmlformats.org/markup-compatibility/2006" xmlns:aink="http://schemas.microsoft.com/office/drawing/2016/ink" xmlns:am3d="http://schemas.microsoft.com/office/drawing/2017/model3d" xmlns:o="urn:schemas-microsoft-com:office:office" xmlns:oel="http://schemas.microsoft.com/office/2019/extlst" xmlns:r="http://schemas.openxmlformats.org/officeDocument/2006/relationships" xmlns:m="http://schemas.openxmlformats.org/officeDocument/2006/math" xmlns:v="urn:schemas-microsoft-com:vml" xmlns:wp14="http://schemas.microsoft.com/office/word/2010/wordprocessingDrawing" xmlns:wp="http://schemas.openxmlformats.org/drawingml/2006/wordprocessingDrawing" xmlns:w10="urn:schemas-microsoft-com:office:word" xmlns:w="http://schemas.openxmlformats.org/wordprocessingml/2006/main" xmlns:w14="http://schemas.microsoft.com/office/word/2010/wordml" xmlns:w15="http://schemas.microsoft.com/office/word/2012/wordml" xmlns:w16cex="http://schemas.microsoft.com/office/word/2018/wordml/cex" xmlns:w16cid="http://schemas.microsoft.com/office/word/2016/wordml/cid" xmlns:w16="http://schemas.microsoft.com/office/word/2018/wordml" xmlns:w16du="http://schemas.microsoft.com/office/word/2023/wordml/word16du" xmlns:w16sdtdh="http://schemas.microsoft.com/office/word/2020/wordml/sdtdatahash" xmlns:w16sdtfl="http://schemas.microsoft.com/office/word/2024/wordml/sdtformatlock" xmlns:w16se="http://schemas.microsoft.com/office/word/2015/wordml/symex" xmlns:wpg="http://schemas.microsoft.com/office/word/2010/wordprocessingGroup" xmlns:wpi="http://schemas.microsoft.com/office/word/2010/wordprocessingInk" xmlns:wne="http://schemas.microsoft.com/office/word/2006/wordml" xmlns:wps="http://schemas.microsoft.com/office/word/2010/wordprocessingShape" mc:Ignorable="w14 w15 w16se w16cid w16 w16cex w16sdtdh w16sdtfl w16du wp14">
+<w:document xmlns:wpc="http://schemas.microsoft.com/office/word/2010/wordprocessingCanvas" xmlns:mc="http://schemas.openxmlformats.org/markup-compatibility/2006" xmlns:o="urn:schemas-microsoft-com:office:office" xmlns:r="http://schemas.openxmlformats.org/officeDocument/2006/relationships" xmlns:m="http://schemas.openxmlformats.org/officeDocument/2006/math" xmlns:v="urn:schemas-microsoft-com:vml" xmlns:wp14="http://schemas.microsoft.com/office/word/2010/wordprocessingDrawing" xmlns:wp="http://schemas.openxmlformats.org/drawingml/2006/wordprocessingDrawing" xmlns:w10="urn:schemas-microsoft-com:office:word" xmlns:w="http://schemas.openxmlformats.org/wordprocessingml/2006/main" xmlns:w14="http://schemas.microsoft.com/office/word/2010/wordml" xmlns:w15="http://schemas.microsoft.com/office/word/2012/wordml" xmlns:w16se="http://schemas.microsoft.com/office/word/2015/wordml/symex" xmlns:w16cid="http://schemas.microsoft.com/office/word/2016/wordml/cid" xmlns:w16="http://schemas.microsoft.com/office/word/2018/wordml" xmlns:w16cex="http://schemas.microsoft.com/office/word/2018/wordml/cex" xmlns:w16sdtdh="http://schemas.microsoft.com/office/word/2020/wordml/sdtdatahash" xmlns:wne="http://schemas.microsoft.com/office/word/2006/wordml" xmlns:wpg="http://schemas.microsoft.com/office/word/2010/wordprocessingGroup" xmlns:wps="http://schemas.microsoft.com/office/word/2010/wordprocessingShape" mc:Ignorable="w14 w15 w16se w16cid w16 w16cex w16sdtdh wp14">
   <w:body>
     <w:p>
       <w:pPr>
@@ -11,50 +11,45 @@
           <w:bCs/>
           <w:sz w:val="24"/>
           <w:szCs w:val="24"/>
-          <w:lang w:val="en-GB"/>
-        </w:rPr>
-      </w:pPr>
-      <w:r>
-        <w:rPr>
-          <w:rFonts w:ascii="Times New Roman" w:hAnsi="Times New Roman" w:cs="Times New Roman"/>
+        </w:rPr>
+      </w:pPr>
+      <w:r>
+        <w:rPr>
+          <w:rFonts w:ascii="Times New Roman" w:hAnsi="Times New Roman" w:eastAsia="Calibri" w:cs="Times New Roman" w:eastAsiaTheme="minorHAnsi"/>
           <w:b/>
           <w:bCs/>
           <w:sz w:val="24"/>
           <w:szCs w:val="24"/>
-          <w:lang w:val="en-GB"/>
         </w:rPr>
         <w:t>LAB1 – VECTORS, MATRICES</w:t>
       </w:r>
       <w:r>
         <w:rPr>
-          <w:rFonts w:ascii="Times New Roman" w:hAnsi="Times New Roman" w:cs="Times New Roman"/>
+          <w:rFonts w:ascii="Times New Roman" w:hAnsi="Times New Roman" w:eastAsia="Calibri" w:cs="Times New Roman" w:eastAsiaTheme="minorHAnsi"/>
           <w:b/>
           <w:bCs/>
           <w:sz w:val="24"/>
           <w:szCs w:val="24"/>
-          <w:lang w:val="en-GB"/>
         </w:rPr>
         <w:t xml:space="preserve">, </w:t>
       </w:r>
       <w:r>
         <w:rPr>
-          <w:rFonts w:ascii="Times New Roman" w:hAnsi="Times New Roman" w:cs="Times New Roman"/>
+          <w:rFonts w:ascii="Times New Roman" w:hAnsi="Times New Roman" w:eastAsia="Calibri" w:cs="Times New Roman" w:eastAsiaTheme="minorHAnsi"/>
           <w:b/>
           <w:bCs/>
           <w:sz w:val="24"/>
           <w:szCs w:val="24"/>
-          <w:lang w:val="en-GB"/>
         </w:rPr>
         <w:t>ARRAYS</w:t>
       </w:r>
       <w:r>
         <w:rPr>
-          <w:rFonts w:ascii="Times New Roman" w:hAnsi="Times New Roman" w:cs="Times New Roman"/>
+          <w:rFonts w:ascii="Times New Roman" w:hAnsi="Times New Roman" w:eastAsia="Calibri" w:cs="Times New Roman" w:eastAsiaTheme="minorHAnsi"/>
           <w:b/>
           <w:bCs/>
           <w:sz w:val="24"/>
           <w:szCs w:val="24"/>
-          <w:lang w:val="en-GB"/>
         </w:rPr>
         <w:t xml:space="preserve"> and DATAFRAMES</w:t>
       </w:r>
@@ -68,7 +63,6 @@
           <w:bCs/>
           <w:sz w:val="24"/>
           <w:szCs w:val="24"/>
-          <w:lang w:val="en-GB"/>
         </w:rPr>
       </w:pPr>
     </w:p>
@@ -79,142 +73,115 @@
           <w:ilvl w:val="0"/>
           <w:numId w:val="1"/>
         </w:numPr>
-        <w:jc w:val="both"/>
-        <w:rPr>
-          <w:rFonts w:ascii="Times New Roman" w:hAnsi="Times New Roman" w:cs="Times New Roman"/>
-          <w:noProof/>
-          <w:sz w:val="24"/>
-          <w:szCs w:val="24"/>
-          <w:lang w:val="en-GB"/>
-        </w:rPr>
-      </w:pPr>
-      <w:r>
-        <w:rPr>
-          <w:rFonts w:ascii="Times New Roman" w:hAnsi="Times New Roman" w:cs="Times New Roman"/>
-          <w:noProof/>
-          <w:sz w:val="24"/>
-          <w:szCs w:val="24"/>
-          <w:lang w:val="en-GB"/>
+        <w:ind w:left="720" w:hanging="360"/>
+        <w:jc w:val="both"/>
+        <w:rPr>
+          <w:rFonts w:ascii="Times New Roman" w:hAnsi="Times New Roman" w:cs="Times New Roman"/>
+          <w:sz w:val="24"/>
+          <w:szCs w:val="24"/>
+        </w:rPr>
+      </w:pPr>
+      <w:r>
+        <w:rPr>
+          <w:rFonts w:ascii="Times New Roman" w:hAnsi="Times New Roman" w:eastAsia="Calibri" w:cs="Times New Roman" w:eastAsiaTheme="minorHAnsi"/>
+          <w:sz w:val="24"/>
+          <w:szCs w:val="24"/>
         </w:rPr>
         <w:t>Create a vector</w:t>
       </w:r>
       <w:r>
         <w:rPr>
-          <w:rFonts w:ascii="Times New Roman" w:hAnsi="Times New Roman" w:cs="Times New Roman"/>
-          <w:noProof/>
-          <w:sz w:val="24"/>
-          <w:szCs w:val="24"/>
-          <w:lang w:val="en-GB"/>
+          <w:rFonts w:ascii="Times New Roman" w:hAnsi="Times New Roman" w:eastAsia="Calibri" w:cs="Times New Roman" w:eastAsiaTheme="minorHAnsi"/>
+          <w:sz w:val="24"/>
+          <w:szCs w:val="24"/>
         </w:rPr>
         <w:t xml:space="preserve"> with three elements</w:t>
       </w:r>
       <w:r>
         <w:rPr>
-          <w:rFonts w:ascii="Times New Roman" w:hAnsi="Times New Roman" w:cs="Times New Roman"/>
-          <w:noProof/>
-          <w:sz w:val="24"/>
-          <w:szCs w:val="24"/>
-          <w:lang w:val="en-GB"/>
+          <w:rFonts w:ascii="Times New Roman" w:hAnsi="Times New Roman" w:eastAsia="Calibri" w:cs="Times New Roman" w:eastAsiaTheme="minorHAnsi"/>
+          <w:sz w:val="24"/>
+          <w:szCs w:val="24"/>
         </w:rPr>
         <w:t xml:space="preserve"> </w:t>
       </w:r>
       <w:r>
         <w:rPr>
-          <w:rFonts w:ascii="Times New Roman" w:hAnsi="Times New Roman" w:cs="Times New Roman"/>
-          <w:noProof/>
-          <w:sz w:val="24"/>
-          <w:szCs w:val="24"/>
-          <w:lang w:val="en-GB"/>
+          <w:rFonts w:ascii="Times New Roman" w:hAnsi="Times New Roman" w:eastAsia="Calibri" w:cs="Times New Roman" w:eastAsiaTheme="minorHAnsi"/>
+          <w:sz w:val="24"/>
+          <w:szCs w:val="24"/>
         </w:rPr>
         <w:t xml:space="preserve">as a </w:t>
       </w:r>
       <w:r>
         <w:rPr>
-          <w:rFonts w:ascii="Times New Roman" w:hAnsi="Times New Roman" w:cs="Times New Roman"/>
-          <w:noProof/>
-          <w:sz w:val="24"/>
-          <w:szCs w:val="24"/>
-          <w:lang w:val="en-GB"/>
+          <w:rFonts w:ascii="Times New Roman" w:hAnsi="Times New Roman" w:eastAsia="Calibri" w:cs="Times New Roman" w:eastAsiaTheme="minorHAnsi"/>
+          <w:sz w:val="24"/>
+          <w:szCs w:val="24"/>
         </w:rPr>
         <w:t>row vector</w:t>
       </w:r>
       <w:r>
         <w:rPr>
-          <w:rFonts w:ascii="Times New Roman" w:hAnsi="Times New Roman" w:cs="Times New Roman"/>
-          <w:noProof/>
-          <w:sz w:val="24"/>
-          <w:szCs w:val="24"/>
-          <w:lang w:val="en-GB"/>
+          <w:rFonts w:ascii="Times New Roman" w:hAnsi="Times New Roman" w:eastAsia="Calibri" w:cs="Times New Roman" w:eastAsiaTheme="minorHAnsi"/>
+          <w:sz w:val="24"/>
+          <w:szCs w:val="24"/>
         </w:rPr>
         <w:t xml:space="preserve"> and</w:t>
       </w:r>
       <w:r>
         <w:rPr>
-          <w:rFonts w:ascii="Times New Roman" w:hAnsi="Times New Roman" w:cs="Times New Roman"/>
-          <w:noProof/>
-          <w:sz w:val="24"/>
-          <w:szCs w:val="24"/>
-          <w:lang w:val="en-GB"/>
+          <w:rFonts w:ascii="Times New Roman" w:hAnsi="Times New Roman" w:eastAsia="Calibri" w:cs="Times New Roman" w:eastAsiaTheme="minorHAnsi"/>
+          <w:sz w:val="24"/>
+          <w:szCs w:val="24"/>
         </w:rPr>
         <w:t xml:space="preserve"> as a </w:t>
       </w:r>
       <w:r>
         <w:rPr>
-          <w:rFonts w:ascii="Times New Roman" w:hAnsi="Times New Roman" w:cs="Times New Roman"/>
-          <w:noProof/>
-          <w:sz w:val="24"/>
-          <w:szCs w:val="24"/>
-          <w:lang w:val="en-GB"/>
+          <w:rFonts w:ascii="Times New Roman" w:hAnsi="Times New Roman" w:eastAsia="Calibri" w:cs="Times New Roman" w:eastAsiaTheme="minorHAnsi"/>
+          <w:sz w:val="24"/>
+          <w:szCs w:val="24"/>
         </w:rPr>
         <w:t>column vector</w:t>
       </w:r>
       <w:r>
         <w:rPr>
-          <w:rFonts w:ascii="Times New Roman" w:hAnsi="Times New Roman" w:cs="Times New Roman"/>
-          <w:noProof/>
-          <w:sz w:val="24"/>
-          <w:szCs w:val="24"/>
-          <w:lang w:val="en-GB"/>
+          <w:rFonts w:ascii="Times New Roman" w:hAnsi="Times New Roman" w:eastAsia="Calibri" w:cs="Times New Roman" w:eastAsiaTheme="minorHAnsi"/>
+          <w:sz w:val="24"/>
+          <w:szCs w:val="24"/>
         </w:rPr>
         <w:t xml:space="preserve"> </w:t>
       </w:r>
       <w:r>
         <w:rPr>
-          <w:rFonts w:ascii="Times New Roman" w:hAnsi="Times New Roman" w:cs="Times New Roman"/>
-          <w:noProof/>
-          <w:sz w:val="24"/>
-          <w:szCs w:val="24"/>
-          <w:lang w:val="en-GB"/>
+          <w:rFonts w:ascii="Times New Roman" w:hAnsi="Times New Roman" w:eastAsia="Calibri" w:cs="Times New Roman" w:eastAsiaTheme="minorHAnsi"/>
+          <w:sz w:val="24"/>
+          <w:szCs w:val="24"/>
         </w:rPr>
         <w:t>using NumPy</w:t>
       </w:r>
       <w:r>
         <w:rPr>
-          <w:rFonts w:ascii="Times New Roman" w:hAnsi="Times New Roman" w:cs="Times New Roman"/>
-          <w:noProof/>
-          <w:sz w:val="24"/>
-          <w:szCs w:val="24"/>
-          <w:lang w:val="en-GB"/>
+          <w:rFonts w:ascii="Times New Roman" w:hAnsi="Times New Roman" w:eastAsia="Calibri" w:cs="Times New Roman" w:eastAsiaTheme="minorHAnsi"/>
+          <w:sz w:val="24"/>
+          <w:szCs w:val="24"/>
         </w:rPr>
         <w:t>.</w:t>
       </w:r>
       <w:r>
         <w:rPr>
-          <w:rFonts w:ascii="Times New Roman" w:hAnsi="Times New Roman" w:cs="Times New Roman"/>
-          <w:noProof/>
-          <w:sz w:val="24"/>
-          <w:szCs w:val="24"/>
-          <w:lang w:val="en-GB"/>
+          <w:rFonts w:ascii="Times New Roman" w:hAnsi="Times New Roman" w:eastAsia="Calibri" w:cs="Times New Roman" w:eastAsiaTheme="minorHAnsi"/>
+          <w:sz w:val="24"/>
+          <w:szCs w:val="24"/>
         </w:rPr>
         <w:t xml:space="preserve"> Display the shapes of </w:t>
       </w:r>
       <w:r>
         <w:rPr>
-          <w:rFonts w:ascii="Times New Roman" w:hAnsi="Times New Roman" w:cs="Times New Roman"/>
-          <w:noProof/>
-          <w:sz w:val="24"/>
-          <w:szCs w:val="24"/>
-          <w:lang w:val="en-GB"/>
+          <w:rFonts w:ascii="Times New Roman" w:hAnsi="Times New Roman" w:eastAsia="Calibri" w:cs="Times New Roman" w:eastAsiaTheme="minorHAnsi"/>
+          <w:sz w:val="24"/>
+          <w:szCs w:val="24"/>
         </w:rPr>
         <w:t xml:space="preserve">both vectors. </w:t>
       </w:r>
@@ -226,124 +193,101 @@
           <w:ilvl w:val="0"/>
           <w:numId w:val="1"/>
         </w:numPr>
-        <w:jc w:val="both"/>
-        <w:rPr>
-          <w:rFonts w:ascii="Times New Roman" w:hAnsi="Times New Roman" w:cs="Times New Roman"/>
-          <w:noProof/>
-          <w:sz w:val="24"/>
-          <w:szCs w:val="24"/>
-          <w:lang w:val="en-GB"/>
-        </w:rPr>
-      </w:pPr>
-      <w:r>
-        <w:rPr>
-          <w:rFonts w:ascii="Times New Roman" w:hAnsi="Times New Roman" w:cs="Times New Roman"/>
-          <w:noProof/>
-          <w:sz w:val="24"/>
-          <w:szCs w:val="24"/>
-          <w:lang w:val="en-GB"/>
+        <w:ind w:left="720" w:hanging="360"/>
+        <w:jc w:val="both"/>
+        <w:rPr>
+          <w:rFonts w:ascii="Times New Roman" w:hAnsi="Times New Roman" w:cs="Times New Roman"/>
+          <w:sz w:val="24"/>
+          <w:szCs w:val="24"/>
+        </w:rPr>
+      </w:pPr>
+      <w:r>
+        <w:rPr>
+          <w:rFonts w:ascii="Times New Roman" w:hAnsi="Times New Roman" w:eastAsia="Calibri" w:cs="Times New Roman" w:eastAsiaTheme="minorHAnsi"/>
+          <w:sz w:val="24"/>
+          <w:szCs w:val="24"/>
         </w:rPr>
         <w:t xml:space="preserve">Define a </w:t>
       </w:r>
       <w:r>
         <w:rPr>
-          <w:rFonts w:ascii="Times New Roman" w:hAnsi="Times New Roman" w:cs="Times New Roman"/>
-          <w:noProof/>
-          <w:sz w:val="24"/>
-          <w:szCs w:val="24"/>
-          <w:lang w:val="en-GB"/>
+          <w:rFonts w:ascii="Times New Roman" w:hAnsi="Times New Roman" w:eastAsia="Calibri" w:cs="Times New Roman" w:eastAsiaTheme="minorHAnsi"/>
+          <w:sz w:val="24"/>
+          <w:szCs w:val="24"/>
         </w:rPr>
         <w:t>NumPy array named</w:t>
       </w:r>
       <w:r>
         <w:rPr>
-          <w:rFonts w:ascii="Times New Roman" w:hAnsi="Times New Roman" w:cs="Times New Roman"/>
-          <w:noProof/>
-          <w:sz w:val="24"/>
-          <w:szCs w:val="24"/>
-          <w:lang w:val="en-GB"/>
+          <w:rFonts w:ascii="Times New Roman" w:hAnsi="Times New Roman" w:eastAsia="Calibri" w:cs="Times New Roman" w:eastAsiaTheme="minorHAnsi"/>
+          <w:sz w:val="24"/>
+          <w:szCs w:val="24"/>
         </w:rPr>
         <w:t xml:space="preserve"> </w:t>
       </w:r>
       <w:r>
         <w:rPr>
-          <w:rFonts w:ascii="Times New Roman" w:hAnsi="Times New Roman" w:cs="Times New Roman"/>
+          <w:rFonts w:ascii="Times New Roman" w:hAnsi="Times New Roman" w:eastAsia="Calibri" w:cs="Times New Roman" w:eastAsiaTheme="minorHAnsi"/>
           <w:i/>
           <w:iCs/>
-          <w:noProof/>
-          <w:sz w:val="24"/>
-          <w:szCs w:val="24"/>
-          <w:lang w:val="en-GB"/>
+          <w:sz w:val="24"/>
+          <w:szCs w:val="24"/>
         </w:rPr>
         <w:t>rand_num</w:t>
       </w:r>
       <w:r>
         <w:rPr>
-          <w:rFonts w:ascii="Times New Roman" w:hAnsi="Times New Roman" w:cs="Times New Roman"/>
-          <w:noProof/>
-          <w:sz w:val="24"/>
-          <w:szCs w:val="24"/>
-          <w:lang w:val="en-GB"/>
+          <w:rFonts w:ascii="Times New Roman" w:hAnsi="Times New Roman" w:eastAsia="Calibri" w:cs="Times New Roman" w:eastAsiaTheme="minorHAnsi"/>
+          <w:sz w:val="24"/>
+          <w:szCs w:val="24"/>
         </w:rPr>
         <w:t xml:space="preserve"> </w:t>
       </w:r>
       <w:r>
         <w:rPr>
-          <w:rFonts w:ascii="Times New Roman" w:hAnsi="Times New Roman" w:cs="Times New Roman"/>
-          <w:noProof/>
-          <w:sz w:val="24"/>
-          <w:szCs w:val="24"/>
-          <w:lang w:val="en-GB"/>
+          <w:rFonts w:ascii="Times New Roman" w:hAnsi="Times New Roman" w:eastAsia="Calibri" w:cs="Times New Roman" w:eastAsiaTheme="minorHAnsi"/>
+          <w:sz w:val="24"/>
+          <w:szCs w:val="24"/>
         </w:rPr>
         <w:t>containing</w:t>
       </w:r>
       <w:r>
         <w:rPr>
-          <w:rFonts w:ascii="Times New Roman" w:hAnsi="Times New Roman" w:cs="Times New Roman"/>
-          <w:noProof/>
-          <w:sz w:val="24"/>
-          <w:szCs w:val="24"/>
-          <w:lang w:val="en-GB"/>
+          <w:rFonts w:ascii="Times New Roman" w:hAnsi="Times New Roman" w:eastAsia="Calibri" w:cs="Times New Roman" w:eastAsiaTheme="minorHAnsi"/>
+          <w:sz w:val="24"/>
+          <w:szCs w:val="24"/>
         </w:rPr>
         <w:t xml:space="preserve"> 30 </w:t>
       </w:r>
       <w:r>
         <w:rPr>
-          <w:rFonts w:ascii="Times New Roman" w:hAnsi="Times New Roman" w:cs="Times New Roman"/>
-          <w:noProof/>
-          <w:sz w:val="24"/>
-          <w:szCs w:val="24"/>
-          <w:lang w:val="en-GB"/>
+          <w:rFonts w:ascii="Times New Roman" w:hAnsi="Times New Roman" w:eastAsia="Calibri" w:cs="Times New Roman" w:eastAsiaTheme="minorHAnsi"/>
+          <w:sz w:val="24"/>
+          <w:szCs w:val="24"/>
         </w:rPr>
         <w:t>equally spaced numbers</w:t>
       </w:r>
       <w:r>
         <w:rPr>
-          <w:rFonts w:ascii="Times New Roman" w:hAnsi="Times New Roman" w:cs="Times New Roman"/>
-          <w:noProof/>
-          <w:sz w:val="24"/>
-          <w:szCs w:val="24"/>
-          <w:lang w:val="en-GB"/>
+          <w:rFonts w:ascii="Times New Roman" w:hAnsi="Times New Roman" w:eastAsia="Calibri" w:cs="Times New Roman" w:eastAsiaTheme="minorHAnsi"/>
+          <w:sz w:val="24"/>
+          <w:szCs w:val="24"/>
         </w:rPr>
         <w:t xml:space="preserve"> between 3 and 100</w:t>
       </w:r>
       <w:r>
         <w:rPr>
-          <w:rFonts w:ascii="Times New Roman" w:hAnsi="Times New Roman" w:cs="Times New Roman"/>
-          <w:noProof/>
-          <w:sz w:val="24"/>
-          <w:szCs w:val="24"/>
-          <w:lang w:val="en-GB"/>
+          <w:rFonts w:ascii="Times New Roman" w:hAnsi="Times New Roman" w:eastAsia="Calibri" w:cs="Times New Roman" w:eastAsiaTheme="minorHAnsi"/>
+          <w:sz w:val="24"/>
+          <w:szCs w:val="24"/>
         </w:rPr>
         <w:t>.</w:t>
       </w:r>
       <w:r>
         <w:rPr>
-          <w:rFonts w:ascii="Times New Roman" w:hAnsi="Times New Roman" w:cs="Times New Roman"/>
-          <w:noProof/>
-          <w:sz w:val="24"/>
-          <w:szCs w:val="24"/>
-          <w:lang w:val="en-GB"/>
+          <w:rFonts w:ascii="Times New Roman" w:hAnsi="Times New Roman" w:eastAsia="Calibri" w:cs="Times New Roman" w:eastAsiaTheme="minorHAnsi"/>
+          <w:sz w:val="24"/>
+          <w:szCs w:val="24"/>
         </w:rPr>
         <w:t xml:space="preserve"> (Hint: use the linspace () function).</w:t>
       </w:r>
@@ -355,112 +299,91 @@
           <w:ilvl w:val="0"/>
           <w:numId w:val="1"/>
         </w:numPr>
-        <w:jc w:val="both"/>
-        <w:rPr>
-          <w:rFonts w:ascii="Times New Roman" w:hAnsi="Times New Roman" w:cs="Times New Roman"/>
-          <w:noProof/>
-          <w:sz w:val="24"/>
-          <w:szCs w:val="24"/>
-          <w:lang w:val="en-GB"/>
-        </w:rPr>
-      </w:pPr>
-      <w:r>
-        <w:rPr>
-          <w:rFonts w:ascii="Times New Roman" w:hAnsi="Times New Roman" w:cs="Times New Roman"/>
-          <w:noProof/>
-          <w:sz w:val="24"/>
-          <w:szCs w:val="24"/>
-          <w:lang w:val="en-GB"/>
+        <w:ind w:left="720" w:hanging="360"/>
+        <w:jc w:val="both"/>
+        <w:rPr>
+          <w:rFonts w:ascii="Times New Roman" w:hAnsi="Times New Roman" w:cs="Times New Roman"/>
+          <w:sz w:val="24"/>
+          <w:szCs w:val="24"/>
+        </w:rPr>
+      </w:pPr>
+      <w:r>
+        <w:rPr>
+          <w:rFonts w:ascii="Times New Roman" w:hAnsi="Times New Roman" w:eastAsia="Calibri" w:cs="Times New Roman" w:eastAsiaTheme="minorHAnsi"/>
+          <w:sz w:val="24"/>
+          <w:szCs w:val="24"/>
         </w:rPr>
         <w:t>Create</w:t>
       </w:r>
       <w:r>
         <w:rPr>
-          <w:rFonts w:ascii="Times New Roman" w:hAnsi="Times New Roman" w:cs="Times New Roman"/>
-          <w:noProof/>
-          <w:sz w:val="24"/>
-          <w:szCs w:val="24"/>
-          <w:lang w:val="en-GB"/>
+          <w:rFonts w:ascii="Times New Roman" w:hAnsi="Times New Roman" w:eastAsia="Calibri" w:cs="Times New Roman" w:eastAsiaTheme="minorHAnsi"/>
+          <w:sz w:val="24"/>
+          <w:szCs w:val="24"/>
         </w:rPr>
         <w:t xml:space="preserve"> a 3x2 matrix (a two dimensional </w:t>
       </w:r>
       <w:r>
         <w:rPr>
-          <w:rFonts w:ascii="Times New Roman" w:hAnsi="Times New Roman" w:cs="Times New Roman"/>
-          <w:noProof/>
-          <w:sz w:val="24"/>
-          <w:szCs w:val="24"/>
-          <w:lang w:val="en-GB"/>
+          <w:rFonts w:ascii="Times New Roman" w:hAnsi="Times New Roman" w:eastAsia="Calibri" w:cs="Times New Roman" w:eastAsiaTheme="minorHAnsi"/>
+          <w:sz w:val="24"/>
+          <w:szCs w:val="24"/>
         </w:rPr>
         <w:t xml:space="preserve">NumPy </w:t>
       </w:r>
       <w:r>
         <w:rPr>
-          <w:rFonts w:ascii="Times New Roman" w:hAnsi="Times New Roman" w:cs="Times New Roman"/>
-          <w:noProof/>
-          <w:sz w:val="24"/>
-          <w:szCs w:val="24"/>
-          <w:lang w:val="en-GB"/>
+          <w:rFonts w:ascii="Times New Roman" w:hAnsi="Times New Roman" w:eastAsia="Calibri" w:cs="Times New Roman" w:eastAsiaTheme="minorHAnsi"/>
+          <w:sz w:val="24"/>
+          <w:szCs w:val="24"/>
         </w:rPr>
         <w:t>array)</w:t>
       </w:r>
       <w:r>
         <w:rPr>
-          <w:rFonts w:ascii="Times New Roman" w:hAnsi="Times New Roman" w:cs="Times New Roman"/>
-          <w:noProof/>
-          <w:sz w:val="24"/>
-          <w:szCs w:val="24"/>
-          <w:lang w:val="en-GB"/>
+          <w:rFonts w:ascii="Times New Roman" w:hAnsi="Times New Roman" w:eastAsia="Calibri" w:cs="Times New Roman" w:eastAsiaTheme="minorHAnsi"/>
+          <w:sz w:val="24"/>
+          <w:szCs w:val="24"/>
         </w:rPr>
         <w:t xml:space="preserve"> </w:t>
       </w:r>
       <w:r>
         <w:rPr>
-          <w:rFonts w:ascii="Times New Roman" w:hAnsi="Times New Roman" w:cs="Times New Roman"/>
-          <w:noProof/>
-          <w:sz w:val="24"/>
-          <w:szCs w:val="24"/>
-          <w:lang w:val="en-GB"/>
+          <w:rFonts w:ascii="Times New Roman" w:hAnsi="Times New Roman" w:eastAsia="Calibri" w:cs="Times New Roman" w:eastAsiaTheme="minorHAnsi"/>
+          <w:sz w:val="24"/>
+          <w:szCs w:val="24"/>
         </w:rPr>
         <w:t>with the values</w:t>
       </w:r>
       <w:r>
         <w:rPr>
-          <w:rFonts w:ascii="Times New Roman" w:hAnsi="Times New Roman" w:cs="Times New Roman"/>
-          <w:noProof/>
-          <w:sz w:val="24"/>
-          <w:szCs w:val="24"/>
-          <w:lang w:val="en-GB"/>
+          <w:rFonts w:ascii="Times New Roman" w:hAnsi="Times New Roman" w:eastAsia="Calibri" w:cs="Times New Roman" w:eastAsiaTheme="minorHAnsi"/>
+          <w:sz w:val="24"/>
+          <w:szCs w:val="24"/>
         </w:rPr>
         <w:t xml:space="preserve"> [[1, 2], [3, 4], [5, 6]]. </w:t>
       </w:r>
       <w:r>
         <w:rPr>
-          <w:rFonts w:ascii="Times New Roman" w:hAnsi="Times New Roman" w:cs="Times New Roman"/>
-          <w:noProof/>
-          <w:sz w:val="24"/>
-          <w:szCs w:val="24"/>
-          <w:lang w:val="en-GB"/>
+          <w:rFonts w:ascii="Times New Roman" w:hAnsi="Times New Roman" w:eastAsia="Calibri" w:cs="Times New Roman" w:eastAsiaTheme="minorHAnsi"/>
+          <w:sz w:val="24"/>
+          <w:szCs w:val="24"/>
         </w:rPr>
         <w:t>D</w:t>
       </w:r>
       <w:r>
         <w:rPr>
-          <w:rFonts w:ascii="Times New Roman" w:hAnsi="Times New Roman" w:cs="Times New Roman"/>
-          <w:noProof/>
-          <w:sz w:val="24"/>
-          <w:szCs w:val="24"/>
-          <w:lang w:val="en-GB"/>
+          <w:rFonts w:ascii="Times New Roman" w:hAnsi="Times New Roman" w:eastAsia="Calibri" w:cs="Times New Roman" w:eastAsiaTheme="minorHAnsi"/>
+          <w:sz w:val="24"/>
+          <w:szCs w:val="24"/>
         </w:rPr>
         <w:t>isplay</w:t>
       </w:r>
       <w:r>
         <w:rPr>
-          <w:rFonts w:ascii="Times New Roman" w:hAnsi="Times New Roman" w:cs="Times New Roman"/>
-          <w:noProof/>
-          <w:sz w:val="24"/>
-          <w:szCs w:val="24"/>
-          <w:lang w:val="en-GB"/>
+          <w:rFonts w:ascii="Times New Roman" w:hAnsi="Times New Roman" w:eastAsia="Calibri" w:cs="Times New Roman" w:eastAsiaTheme="minorHAnsi"/>
+          <w:sz w:val="24"/>
+          <w:szCs w:val="24"/>
         </w:rPr>
         <w:t xml:space="preserve"> the shape, size, and dimensions of the matrix.</w:t>
       </w:r>
@@ -472,22 +395,19 @@
           <w:ilvl w:val="0"/>
           <w:numId w:val="1"/>
         </w:numPr>
-        <w:jc w:val="both"/>
-        <w:rPr>
-          <w:rFonts w:ascii="Times New Roman" w:hAnsi="Times New Roman" w:cs="Times New Roman"/>
-          <w:noProof/>
-          <w:sz w:val="24"/>
-          <w:szCs w:val="24"/>
-          <w:lang w:val="en-GB"/>
-        </w:rPr>
-      </w:pPr>
-      <w:r>
-        <w:rPr>
-          <w:rFonts w:ascii="Times New Roman" w:hAnsi="Times New Roman" w:cs="Times New Roman"/>
-          <w:noProof/>
-          <w:sz w:val="24"/>
-          <w:szCs w:val="24"/>
-          <w:lang w:val="en-GB"/>
+        <w:ind w:left="720" w:hanging="360"/>
+        <w:jc w:val="both"/>
+        <w:rPr>
+          <w:rFonts w:ascii="Times New Roman" w:hAnsi="Times New Roman" w:cs="Times New Roman"/>
+          <w:sz w:val="24"/>
+          <w:szCs w:val="24"/>
+        </w:rPr>
+      </w:pPr>
+      <w:r>
+        <w:rPr>
+          <w:rFonts w:ascii="Times New Roman" w:hAnsi="Times New Roman" w:eastAsia="Calibri" w:cs="Times New Roman" w:eastAsiaTheme="minorHAnsi"/>
+          <w:sz w:val="24"/>
+          <w:szCs w:val="24"/>
         </w:rPr>
         <w:t xml:space="preserve">The following matrix contains only a few nonzero values. Represent it efficiently using a sparse matrix in CSR (Compressed Sparse Row) format. </w:t>
       </w:r>
@@ -497,29 +417,23 @@
         <w:jc w:val="both"/>
         <w:rPr>
           <w:rFonts w:ascii="Times New Roman" w:hAnsi="Times New Roman" w:cs="Times New Roman"/>
-          <w:noProof/>
-          <w:sz w:val="24"/>
-          <w:szCs w:val="24"/>
-          <w:lang w:val="en-GB"/>
-        </w:rPr>
-      </w:pPr>
-      <w:r>
-        <w:rPr>
-          <w:rFonts w:ascii="Times New Roman" w:hAnsi="Times New Roman" w:cs="Times New Roman"/>
-          <w:noProof/>
-          <w:sz w:val="24"/>
-          <w:szCs w:val="24"/>
-          <w:lang w:val="en-GB"/>
+          <w:sz w:val="24"/>
+          <w:szCs w:val="24"/>
+        </w:rPr>
+      </w:pPr>
+      <w:r>
+        <w:rPr>
+          <w:rFonts w:ascii="Times New Roman" w:hAnsi="Times New Roman" w:eastAsia="Calibri" w:cs="Times New Roman" w:eastAsiaTheme="minorHAnsi"/>
+          <w:sz w:val="24"/>
+          <w:szCs w:val="24"/>
         </w:rPr>
         <w:t xml:space="preserve">                                                </w:t>
       </w:r>
       <w:r>
         <w:rPr>
-          <w:rFonts w:ascii="Times New Roman" w:hAnsi="Times New Roman" w:cs="Times New Roman"/>
-          <w:noProof/>
-          <w:sz w:val="24"/>
-          <w:szCs w:val="24"/>
-          <w:lang w:val="en-GB"/>
+          <w:rFonts w:ascii="Times New Roman" w:hAnsi="Times New Roman" w:eastAsia="Calibri" w:cs="Times New Roman" w:eastAsiaTheme="minorHAnsi"/>
+          <w:sz w:val="24"/>
+          <w:szCs w:val="24"/>
         </w:rPr>
         <w:t>[[0, 0, 0, 0, 0, 0, 0, 0, 0, 0],</w:t>
       </w:r>
@@ -530,29 +444,23 @@
         <w:jc w:val="both"/>
         <w:rPr>
           <w:rFonts w:ascii="Times New Roman" w:hAnsi="Times New Roman" w:cs="Times New Roman"/>
-          <w:noProof/>
-          <w:sz w:val="24"/>
-          <w:szCs w:val="24"/>
-          <w:lang w:val="en-GB"/>
-        </w:rPr>
-      </w:pPr>
-      <w:r>
-        <w:rPr>
-          <w:rFonts w:ascii="Times New Roman" w:hAnsi="Times New Roman" w:cs="Times New Roman"/>
-          <w:noProof/>
-          <w:sz w:val="24"/>
-          <w:szCs w:val="24"/>
-          <w:lang w:val="en-GB"/>
+          <w:sz w:val="24"/>
+          <w:szCs w:val="24"/>
+        </w:rPr>
+      </w:pPr>
+      <w:r>
+        <w:rPr>
+          <w:rFonts w:ascii="Times New Roman" w:hAnsi="Times New Roman" w:eastAsia="Calibri" w:cs="Times New Roman" w:eastAsiaTheme="minorHAnsi"/>
+          <w:sz w:val="24"/>
+          <w:szCs w:val="24"/>
         </w:rPr>
         <w:t xml:space="preserve">  </w:t>
       </w:r>
       <w:r>
         <w:rPr>
-          <w:rFonts w:ascii="Times New Roman" w:hAnsi="Times New Roman" w:cs="Times New Roman"/>
-          <w:noProof/>
-          <w:sz w:val="24"/>
-          <w:szCs w:val="24"/>
-          <w:lang w:val="en-GB"/>
+          <w:rFonts w:ascii="Times New Roman" w:hAnsi="Times New Roman" w:eastAsia="Calibri" w:cs="Times New Roman" w:eastAsiaTheme="minorHAnsi"/>
+          <w:sz w:val="24"/>
+          <w:szCs w:val="24"/>
         </w:rPr>
         <w:t>[0, 1, 0, 0, 0, 0, 0, 0, 0, 0],</w:t>
       </w:r>
@@ -563,29 +471,23 @@
         <w:jc w:val="both"/>
         <w:rPr>
           <w:rFonts w:ascii="Times New Roman" w:hAnsi="Times New Roman" w:cs="Times New Roman"/>
-          <w:noProof/>
-          <w:sz w:val="24"/>
-          <w:szCs w:val="24"/>
-          <w:lang w:val="en-GB"/>
-        </w:rPr>
-      </w:pPr>
-      <w:r>
-        <w:rPr>
-          <w:rFonts w:ascii="Times New Roman" w:hAnsi="Times New Roman" w:cs="Times New Roman"/>
-          <w:noProof/>
-          <w:sz w:val="24"/>
-          <w:szCs w:val="24"/>
-          <w:lang w:val="en-GB"/>
+          <w:sz w:val="24"/>
+          <w:szCs w:val="24"/>
+        </w:rPr>
+      </w:pPr>
+      <w:r>
+        <w:rPr>
+          <w:rFonts w:ascii="Times New Roman" w:hAnsi="Times New Roman" w:eastAsia="Calibri" w:cs="Times New Roman" w:eastAsiaTheme="minorHAnsi"/>
+          <w:sz w:val="24"/>
+          <w:szCs w:val="24"/>
         </w:rPr>
         <w:t xml:space="preserve">  </w:t>
       </w:r>
       <w:r>
         <w:rPr>
-          <w:rFonts w:ascii="Times New Roman" w:hAnsi="Times New Roman" w:cs="Times New Roman"/>
-          <w:noProof/>
-          <w:sz w:val="24"/>
-          <w:szCs w:val="24"/>
-          <w:lang w:val="en-GB"/>
+          <w:rFonts w:ascii="Times New Roman" w:hAnsi="Times New Roman" w:eastAsia="Calibri" w:cs="Times New Roman" w:eastAsiaTheme="minorHAnsi"/>
+          <w:sz w:val="24"/>
+          <w:szCs w:val="24"/>
         </w:rPr>
         <w:t>[3, 0, 0, 0, 0, 0, 0, 0, 0, 0]]</w:t>
       </w:r>
@@ -597,82 +499,67 @@
           <w:ilvl w:val="0"/>
           <w:numId w:val="1"/>
         </w:numPr>
-        <w:jc w:val="both"/>
-        <w:rPr>
-          <w:rFonts w:ascii="Times New Roman" w:hAnsi="Times New Roman" w:cs="Times New Roman"/>
-          <w:noProof/>
-          <w:sz w:val="24"/>
-          <w:szCs w:val="24"/>
-          <w:lang w:val="en-GB"/>
-        </w:rPr>
-      </w:pPr>
-      <w:r>
-        <w:rPr>
-          <w:rFonts w:ascii="Times New Roman" w:hAnsi="Times New Roman" w:cs="Times New Roman"/>
-          <w:noProof/>
-          <w:sz w:val="24"/>
-          <w:szCs w:val="24"/>
-          <w:lang w:val="en-GB"/>
+        <w:ind w:left="720" w:hanging="360"/>
+        <w:jc w:val="both"/>
+        <w:rPr>
+          <w:rFonts w:ascii="Times New Roman" w:hAnsi="Times New Roman" w:cs="Times New Roman"/>
+          <w:sz w:val="24"/>
+          <w:szCs w:val="24"/>
+        </w:rPr>
+      </w:pPr>
+      <w:r>
+        <w:rPr>
+          <w:rFonts w:ascii="Times New Roman" w:hAnsi="Times New Roman" w:eastAsia="Calibri" w:cs="Times New Roman" w:eastAsiaTheme="minorHAnsi"/>
+          <w:sz w:val="24"/>
+          <w:szCs w:val="24"/>
         </w:rPr>
         <w:t xml:space="preserve">Answer the </w:t>
       </w:r>
       <w:r>
         <w:rPr>
-          <w:rFonts w:ascii="Times New Roman" w:hAnsi="Times New Roman" w:cs="Times New Roman"/>
-          <w:noProof/>
-          <w:sz w:val="24"/>
-          <w:szCs w:val="24"/>
-          <w:lang w:val="en-GB"/>
+          <w:rFonts w:ascii="Times New Roman" w:hAnsi="Times New Roman" w:eastAsia="Calibri" w:cs="Times New Roman" w:eastAsiaTheme="minorHAnsi"/>
+          <w:sz w:val="24"/>
+          <w:szCs w:val="24"/>
         </w:rPr>
         <w:t>following</w:t>
       </w:r>
       <w:r>
         <w:rPr>
-          <w:rFonts w:ascii="Times New Roman" w:hAnsi="Times New Roman" w:cs="Times New Roman"/>
-          <w:noProof/>
-          <w:sz w:val="24"/>
-          <w:szCs w:val="24"/>
-          <w:lang w:val="en-GB"/>
+          <w:rFonts w:ascii="Times New Roman" w:hAnsi="Times New Roman" w:eastAsia="Calibri" w:cs="Times New Roman" w:eastAsiaTheme="minorHAnsi"/>
+          <w:sz w:val="24"/>
+          <w:szCs w:val="24"/>
         </w:rPr>
         <w:t xml:space="preserve"> questions</w:t>
       </w:r>
       <w:r>
         <w:rPr>
-          <w:rFonts w:ascii="Times New Roman" w:hAnsi="Times New Roman" w:cs="Times New Roman"/>
-          <w:noProof/>
-          <w:sz w:val="24"/>
-          <w:szCs w:val="24"/>
-          <w:lang w:val="en-GB"/>
+          <w:rFonts w:ascii="Times New Roman" w:hAnsi="Times New Roman" w:eastAsia="Calibri" w:cs="Times New Roman" w:eastAsiaTheme="minorHAnsi"/>
+          <w:sz w:val="24"/>
+          <w:szCs w:val="24"/>
         </w:rPr>
         <w:t xml:space="preserve"> using</w:t>
       </w:r>
       <w:r>
         <w:rPr>
-          <w:rFonts w:ascii="Times New Roman" w:hAnsi="Times New Roman" w:cs="Times New Roman"/>
-          <w:noProof/>
-          <w:sz w:val="24"/>
-          <w:szCs w:val="24"/>
-          <w:lang w:val="en-GB"/>
+          <w:rFonts w:ascii="Times New Roman" w:hAnsi="Times New Roman" w:eastAsia="Calibri" w:cs="Times New Roman" w:eastAsiaTheme="minorHAnsi"/>
+          <w:sz w:val="24"/>
+          <w:szCs w:val="24"/>
         </w:rPr>
         <w:t xml:space="preserve"> the given vector: [1, 2, 3, 4, 5, 6] and the matrix: </w:t>
       </w:r>
       <w:r>
         <w:rPr>
-          <w:rFonts w:ascii="Times New Roman" w:hAnsi="Times New Roman" w:cs="Times New Roman"/>
-          <w:noProof/>
-          <w:sz w:val="24"/>
-          <w:szCs w:val="24"/>
-          <w:lang w:val="en-GB"/>
+          <w:rFonts w:ascii="Times New Roman" w:hAnsi="Times New Roman" w:eastAsia="Calibri" w:cs="Times New Roman" w:eastAsiaTheme="minorHAnsi"/>
+          <w:sz w:val="24"/>
+          <w:szCs w:val="24"/>
         </w:rPr>
         <w:t xml:space="preserve">  </w:t>
       </w:r>
       <w:r>
         <w:rPr>
-          <w:rFonts w:ascii="Times New Roman" w:hAnsi="Times New Roman" w:cs="Times New Roman"/>
-          <w:noProof/>
-          <w:sz w:val="24"/>
-          <w:szCs w:val="24"/>
-          <w:lang w:val="en-GB"/>
+          <w:rFonts w:ascii="Times New Roman" w:hAnsi="Times New Roman" w:eastAsia="Calibri" w:cs="Times New Roman" w:eastAsiaTheme="minorHAnsi"/>
+          <w:sz w:val="24"/>
+          <w:szCs w:val="24"/>
         </w:rPr>
         <w:t xml:space="preserve">[[1, 2, 3], </w:t>
       </w:r>
@@ -683,19 +570,15 @@
         <w:jc w:val="both"/>
         <w:rPr>
           <w:rFonts w:ascii="Times New Roman" w:hAnsi="Times New Roman" w:cs="Times New Roman"/>
-          <w:noProof/>
-          <w:sz w:val="24"/>
-          <w:szCs w:val="24"/>
-          <w:lang w:val="en-GB"/>
-        </w:rPr>
-      </w:pPr>
-      <w:r>
-        <w:rPr>
-          <w:rFonts w:ascii="Times New Roman" w:hAnsi="Times New Roman" w:cs="Times New Roman"/>
-          <w:noProof/>
-          <w:sz w:val="24"/>
-          <w:szCs w:val="24"/>
-          <w:lang w:val="en-GB"/>
+          <w:sz w:val="24"/>
+          <w:szCs w:val="24"/>
+        </w:rPr>
+      </w:pPr>
+      <w:r>
+        <w:rPr>
+          <w:rFonts w:ascii="Times New Roman" w:hAnsi="Times New Roman" w:eastAsia="Calibri" w:cs="Times New Roman" w:eastAsiaTheme="minorHAnsi"/>
+          <w:sz w:val="24"/>
+          <w:szCs w:val="24"/>
         </w:rPr>
         <w:t>[4, 5, 6],</w:t>
       </w:r>
@@ -706,19 +589,15 @@
         <w:jc w:val="both"/>
         <w:rPr>
           <w:rFonts w:ascii="Times New Roman" w:hAnsi="Times New Roman" w:cs="Times New Roman"/>
-          <w:noProof/>
-          <w:sz w:val="24"/>
-          <w:szCs w:val="24"/>
-          <w:lang w:val="en-GB"/>
-        </w:rPr>
-      </w:pPr>
-      <w:r>
-        <w:rPr>
-          <w:rFonts w:ascii="Times New Roman" w:hAnsi="Times New Roman" w:cs="Times New Roman"/>
-          <w:noProof/>
-          <w:sz w:val="24"/>
-          <w:szCs w:val="24"/>
-          <w:lang w:val="en-GB"/>
+          <w:sz w:val="24"/>
+          <w:szCs w:val="24"/>
+        </w:rPr>
+      </w:pPr>
+      <w:r>
+        <w:rPr>
+          <w:rFonts w:ascii="Times New Roman" w:hAnsi="Times New Roman" w:eastAsia="Calibri" w:cs="Times New Roman" w:eastAsiaTheme="minorHAnsi"/>
+          <w:sz w:val="24"/>
+          <w:szCs w:val="24"/>
         </w:rPr>
         <w:t>[7, 8, 9]]</w:t>
       </w:r>
@@ -730,10 +609,8 @@
         <w:jc w:val="both"/>
         <w:rPr>
           <w:rFonts w:ascii="Times New Roman" w:hAnsi="Times New Roman" w:cs="Times New Roman"/>
-          <w:noProof/>
-          <w:sz w:val="24"/>
-          <w:szCs w:val="24"/>
-          <w:lang w:val="en-GB"/>
+          <w:sz w:val="24"/>
+          <w:szCs w:val="24"/>
         </w:rPr>
       </w:pPr>
     </w:p>
@@ -744,22 +621,19 @@
           <w:ilvl w:val="3"/>
           <w:numId w:val="3"/>
         </w:numPr>
-        <w:jc w:val="both"/>
-        <w:rPr>
-          <w:rFonts w:ascii="Times New Roman" w:hAnsi="Times New Roman" w:cs="Times New Roman"/>
-          <w:noProof/>
-          <w:sz w:val="24"/>
-          <w:szCs w:val="24"/>
-          <w:lang w:val="en-GB"/>
-        </w:rPr>
-      </w:pPr>
-      <w:r>
-        <w:rPr>
-          <w:rFonts w:ascii="Times New Roman" w:hAnsi="Times New Roman" w:cs="Times New Roman"/>
-          <w:noProof/>
-          <w:sz w:val="24"/>
-          <w:szCs w:val="24"/>
-          <w:lang w:val="en-GB"/>
+        <w:ind w:left="1440" w:hanging="360"/>
+        <w:jc w:val="both"/>
+        <w:rPr>
+          <w:rFonts w:ascii="Times New Roman" w:hAnsi="Times New Roman" w:cs="Times New Roman"/>
+          <w:sz w:val="24"/>
+          <w:szCs w:val="24"/>
+        </w:rPr>
+      </w:pPr>
+      <w:r>
+        <w:rPr>
+          <w:rFonts w:ascii="Times New Roman" w:hAnsi="Times New Roman" w:eastAsia="Calibri" w:cs="Times New Roman" w:eastAsiaTheme="minorHAnsi"/>
+          <w:sz w:val="24"/>
+          <w:szCs w:val="24"/>
         </w:rPr>
         <w:t>Select all elements of the vector</w:t>
       </w:r>
@@ -771,42 +645,35 @@
           <w:ilvl w:val="3"/>
           <w:numId w:val="3"/>
         </w:numPr>
-        <w:jc w:val="both"/>
-        <w:rPr>
-          <w:rFonts w:ascii="Times New Roman" w:hAnsi="Times New Roman" w:cs="Times New Roman"/>
-          <w:noProof/>
-          <w:sz w:val="24"/>
-          <w:szCs w:val="24"/>
-          <w:lang w:val="en-GB"/>
-        </w:rPr>
-      </w:pPr>
-      <w:r>
-        <w:rPr>
-          <w:rFonts w:ascii="Times New Roman" w:hAnsi="Times New Roman" w:cs="Times New Roman"/>
-          <w:noProof/>
-          <w:sz w:val="24"/>
-          <w:szCs w:val="24"/>
-          <w:lang w:val="en-GB"/>
+        <w:ind w:left="1440" w:hanging="360"/>
+        <w:jc w:val="both"/>
+        <w:rPr>
+          <w:rFonts w:ascii="Times New Roman" w:hAnsi="Times New Roman" w:cs="Times New Roman"/>
+          <w:sz w:val="24"/>
+          <w:szCs w:val="24"/>
+        </w:rPr>
+      </w:pPr>
+      <w:r>
+        <w:rPr>
+          <w:rFonts w:ascii="Times New Roman" w:hAnsi="Times New Roman" w:eastAsia="Calibri" w:cs="Times New Roman" w:eastAsiaTheme="minorHAnsi"/>
+          <w:sz w:val="24"/>
+          <w:szCs w:val="24"/>
         </w:rPr>
         <w:t xml:space="preserve">Select </w:t>
       </w:r>
       <w:r>
         <w:rPr>
-          <w:rFonts w:ascii="Times New Roman" w:hAnsi="Times New Roman" w:cs="Times New Roman"/>
-          <w:noProof/>
-          <w:sz w:val="24"/>
-          <w:szCs w:val="24"/>
-          <w:lang w:val="en-GB"/>
+          <w:rFonts w:ascii="Times New Roman" w:hAnsi="Times New Roman" w:eastAsia="Calibri" w:cs="Times New Roman" w:eastAsiaTheme="minorHAnsi"/>
+          <w:sz w:val="24"/>
+          <w:szCs w:val="24"/>
         </w:rPr>
         <w:t>all elements</w:t>
       </w:r>
       <w:r>
         <w:rPr>
-          <w:rFonts w:ascii="Times New Roman" w:hAnsi="Times New Roman" w:cs="Times New Roman"/>
-          <w:noProof/>
-          <w:sz w:val="24"/>
-          <w:szCs w:val="24"/>
-          <w:lang w:val="en-GB"/>
+          <w:rFonts w:ascii="Times New Roman" w:hAnsi="Times New Roman" w:eastAsia="Calibri" w:cs="Times New Roman" w:eastAsiaTheme="minorHAnsi"/>
+          <w:sz w:val="24"/>
+          <w:szCs w:val="24"/>
         </w:rPr>
         <w:t xml:space="preserve"> up to and including the third element of the vector</w:t>
       </w:r>
@@ -818,42 +685,35 @@
           <w:ilvl w:val="3"/>
           <w:numId w:val="3"/>
         </w:numPr>
-        <w:jc w:val="both"/>
-        <w:rPr>
-          <w:rFonts w:ascii="Times New Roman" w:hAnsi="Times New Roman" w:cs="Times New Roman"/>
-          <w:noProof/>
-          <w:sz w:val="24"/>
-          <w:szCs w:val="24"/>
-          <w:lang w:val="en-GB"/>
-        </w:rPr>
-      </w:pPr>
-      <w:r>
-        <w:rPr>
-          <w:rFonts w:ascii="Times New Roman" w:hAnsi="Times New Roman" w:cs="Times New Roman"/>
-          <w:noProof/>
-          <w:sz w:val="24"/>
-          <w:szCs w:val="24"/>
-          <w:lang w:val="en-GB"/>
+        <w:ind w:left="1440" w:hanging="360"/>
+        <w:jc w:val="both"/>
+        <w:rPr>
+          <w:rFonts w:ascii="Times New Roman" w:hAnsi="Times New Roman" w:cs="Times New Roman"/>
+          <w:sz w:val="24"/>
+          <w:szCs w:val="24"/>
+        </w:rPr>
+      </w:pPr>
+      <w:r>
+        <w:rPr>
+          <w:rFonts w:ascii="Times New Roman" w:hAnsi="Times New Roman" w:eastAsia="Calibri" w:cs="Times New Roman" w:eastAsiaTheme="minorHAnsi"/>
+          <w:sz w:val="24"/>
+          <w:szCs w:val="24"/>
         </w:rPr>
         <w:t xml:space="preserve">Select </w:t>
       </w:r>
       <w:r>
         <w:rPr>
-          <w:rFonts w:ascii="Times New Roman" w:hAnsi="Times New Roman" w:cs="Times New Roman"/>
-          <w:noProof/>
-          <w:sz w:val="24"/>
-          <w:szCs w:val="24"/>
-          <w:lang w:val="en-GB"/>
+          <w:rFonts w:ascii="Times New Roman" w:hAnsi="Times New Roman" w:eastAsia="Calibri" w:cs="Times New Roman" w:eastAsiaTheme="minorHAnsi"/>
+          <w:sz w:val="24"/>
+          <w:szCs w:val="24"/>
         </w:rPr>
         <w:t>all elements</w:t>
       </w:r>
       <w:r>
         <w:rPr>
-          <w:rFonts w:ascii="Times New Roman" w:hAnsi="Times New Roman" w:cs="Times New Roman"/>
-          <w:noProof/>
-          <w:sz w:val="24"/>
-          <w:szCs w:val="24"/>
-          <w:lang w:val="en-GB"/>
+          <w:rFonts w:ascii="Times New Roman" w:hAnsi="Times New Roman" w:eastAsia="Calibri" w:cs="Times New Roman" w:eastAsiaTheme="minorHAnsi"/>
+          <w:sz w:val="24"/>
+          <w:szCs w:val="24"/>
         </w:rPr>
         <w:t xml:space="preserve"> after the third element of the vector</w:t>
       </w:r>
@@ -865,22 +725,19 @@
           <w:ilvl w:val="3"/>
           <w:numId w:val="3"/>
         </w:numPr>
-        <w:jc w:val="both"/>
-        <w:rPr>
-          <w:rFonts w:ascii="Times New Roman" w:hAnsi="Times New Roman" w:cs="Times New Roman"/>
-          <w:noProof/>
-          <w:sz w:val="24"/>
-          <w:szCs w:val="24"/>
-          <w:lang w:val="en-GB"/>
-        </w:rPr>
-      </w:pPr>
-      <w:r>
-        <w:rPr>
-          <w:rFonts w:ascii="Times New Roman" w:hAnsi="Times New Roman" w:cs="Times New Roman"/>
-          <w:noProof/>
-          <w:sz w:val="24"/>
-          <w:szCs w:val="24"/>
-          <w:lang w:val="en-GB"/>
+        <w:ind w:left="1440" w:hanging="360"/>
+        <w:jc w:val="both"/>
+        <w:rPr>
+          <w:rFonts w:ascii="Times New Roman" w:hAnsi="Times New Roman" w:cs="Times New Roman"/>
+          <w:sz w:val="24"/>
+          <w:szCs w:val="24"/>
+        </w:rPr>
+      </w:pPr>
+      <w:r>
+        <w:rPr>
+          <w:rFonts w:ascii="Times New Roman" w:hAnsi="Times New Roman" w:eastAsia="Calibri" w:cs="Times New Roman" w:eastAsiaTheme="minorHAnsi"/>
+          <w:sz w:val="24"/>
+          <w:szCs w:val="24"/>
         </w:rPr>
         <w:t>Select the last element of the vector</w:t>
       </w:r>
@@ -892,32 +749,27 @@
           <w:ilvl w:val="3"/>
           <w:numId w:val="3"/>
         </w:numPr>
-        <w:jc w:val="both"/>
-        <w:rPr>
-          <w:rFonts w:ascii="Times New Roman" w:hAnsi="Times New Roman" w:cs="Times New Roman"/>
-          <w:noProof/>
-          <w:sz w:val="24"/>
-          <w:szCs w:val="24"/>
-          <w:lang w:val="en-GB"/>
-        </w:rPr>
-      </w:pPr>
-      <w:r>
-        <w:rPr>
-          <w:rFonts w:ascii="Times New Roman" w:hAnsi="Times New Roman" w:cs="Times New Roman"/>
-          <w:noProof/>
-          <w:sz w:val="24"/>
-          <w:szCs w:val="24"/>
-          <w:lang w:val="en-GB"/>
+        <w:ind w:left="1440" w:hanging="360"/>
+        <w:jc w:val="both"/>
+        <w:rPr>
+          <w:rFonts w:ascii="Times New Roman" w:hAnsi="Times New Roman" w:cs="Times New Roman"/>
+          <w:sz w:val="24"/>
+          <w:szCs w:val="24"/>
+        </w:rPr>
+      </w:pPr>
+      <w:r>
+        <w:rPr>
+          <w:rFonts w:ascii="Times New Roman" w:hAnsi="Times New Roman" w:eastAsia="Calibri" w:cs="Times New Roman" w:eastAsiaTheme="minorHAnsi"/>
+          <w:sz w:val="24"/>
+          <w:szCs w:val="24"/>
         </w:rPr>
         <w:t>Select all rows and the second column of the matrix</w:t>
       </w:r>
       <w:r>
         <w:rPr>
-          <w:rFonts w:ascii="Times New Roman" w:hAnsi="Times New Roman" w:cs="Times New Roman"/>
-          <w:noProof/>
-          <w:sz w:val="24"/>
-          <w:szCs w:val="24"/>
-          <w:lang w:val="en-GB"/>
+          <w:rFonts w:ascii="Times New Roman" w:hAnsi="Times New Roman" w:eastAsia="Calibri" w:cs="Times New Roman" w:eastAsiaTheme="minorHAnsi"/>
+          <w:sz w:val="24"/>
+          <w:szCs w:val="24"/>
         </w:rPr>
         <w:t>.</w:t>
       </w:r>
@@ -929,92 +781,75 @@
           <w:ilvl w:val="3"/>
           <w:numId w:val="3"/>
         </w:numPr>
-        <w:jc w:val="both"/>
-        <w:rPr>
-          <w:rFonts w:ascii="Times New Roman" w:hAnsi="Times New Roman" w:cs="Times New Roman"/>
-          <w:noProof/>
-          <w:sz w:val="24"/>
-          <w:szCs w:val="24"/>
-          <w:lang w:val="en-GB"/>
-        </w:rPr>
-      </w:pPr>
-      <w:r>
-        <w:rPr>
-          <w:rFonts w:ascii="Times New Roman" w:hAnsi="Times New Roman" w:cs="Times New Roman"/>
-          <w:noProof/>
-          <w:sz w:val="24"/>
-          <w:szCs w:val="24"/>
-          <w:lang w:val="en-GB"/>
+        <w:ind w:left="1440" w:hanging="360"/>
+        <w:jc w:val="both"/>
+        <w:rPr>
+          <w:rFonts w:ascii="Times New Roman" w:hAnsi="Times New Roman" w:cs="Times New Roman"/>
+          <w:sz w:val="24"/>
+          <w:szCs w:val="24"/>
+        </w:rPr>
+      </w:pPr>
+      <w:r>
+        <w:rPr>
+          <w:rFonts w:ascii="Times New Roman" w:hAnsi="Times New Roman" w:eastAsia="Calibri" w:cs="Times New Roman" w:eastAsiaTheme="minorHAnsi"/>
+          <w:sz w:val="24"/>
+          <w:szCs w:val="24"/>
         </w:rPr>
         <w:t>F</w:t>
       </w:r>
       <w:r>
         <w:rPr>
-          <w:rFonts w:ascii="Times New Roman" w:hAnsi="Times New Roman" w:cs="Times New Roman"/>
-          <w:noProof/>
-          <w:sz w:val="24"/>
-          <w:szCs w:val="24"/>
-          <w:lang w:val="en-GB"/>
+          <w:rFonts w:ascii="Times New Roman" w:hAnsi="Times New Roman" w:eastAsia="Calibri" w:cs="Times New Roman" w:eastAsiaTheme="minorHAnsi"/>
+          <w:sz w:val="24"/>
+          <w:szCs w:val="24"/>
         </w:rPr>
         <w:t>ind the max</w:t>
       </w:r>
       <w:r>
         <w:rPr>
-          <w:rFonts w:ascii="Times New Roman" w:hAnsi="Times New Roman" w:cs="Times New Roman"/>
-          <w:noProof/>
-          <w:sz w:val="24"/>
-          <w:szCs w:val="24"/>
-          <w:lang w:val="en-GB"/>
+          <w:rFonts w:ascii="Times New Roman" w:hAnsi="Times New Roman" w:eastAsia="Calibri" w:cs="Times New Roman" w:eastAsiaTheme="minorHAnsi"/>
+          <w:sz w:val="24"/>
+          <w:szCs w:val="24"/>
         </w:rPr>
         <w:t>/</w:t>
       </w:r>
       <w:r>
         <w:rPr>
-          <w:rFonts w:ascii="Times New Roman" w:hAnsi="Times New Roman" w:cs="Times New Roman"/>
-          <w:noProof/>
-          <w:sz w:val="24"/>
-          <w:szCs w:val="24"/>
-          <w:lang w:val="en-GB"/>
+          <w:rFonts w:ascii="Times New Roman" w:hAnsi="Times New Roman" w:eastAsia="Calibri" w:cs="Times New Roman" w:eastAsiaTheme="minorHAnsi"/>
+          <w:sz w:val="24"/>
+          <w:szCs w:val="24"/>
         </w:rPr>
         <w:t>min</w:t>
       </w:r>
       <w:r>
         <w:rPr>
-          <w:rFonts w:ascii="Times New Roman" w:hAnsi="Times New Roman" w:cs="Times New Roman"/>
-          <w:noProof/>
-          <w:sz w:val="24"/>
-          <w:szCs w:val="24"/>
-          <w:lang w:val="en-GB"/>
+          <w:rFonts w:ascii="Times New Roman" w:hAnsi="Times New Roman" w:eastAsia="Calibri" w:cs="Times New Roman" w:eastAsiaTheme="minorHAnsi"/>
+          <w:sz w:val="24"/>
+          <w:szCs w:val="24"/>
         </w:rPr>
         <w:t xml:space="preserve"> values</w:t>
       </w:r>
       <w:r>
         <w:rPr>
-          <w:rFonts w:ascii="Times New Roman" w:hAnsi="Times New Roman" w:cs="Times New Roman"/>
-          <w:noProof/>
-          <w:sz w:val="24"/>
-          <w:szCs w:val="24"/>
-          <w:lang w:val="en-GB"/>
+          <w:rFonts w:ascii="Times New Roman" w:hAnsi="Times New Roman" w:eastAsia="Calibri" w:cs="Times New Roman" w:eastAsiaTheme="minorHAnsi"/>
+          <w:sz w:val="24"/>
+          <w:szCs w:val="24"/>
         </w:rPr>
         <w:t xml:space="preserve">, mean, variance and standard deviation of the </w:t>
       </w:r>
       <w:r>
         <w:rPr>
-          <w:rFonts w:ascii="Times New Roman" w:hAnsi="Times New Roman" w:cs="Times New Roman"/>
-          <w:noProof/>
-          <w:sz w:val="24"/>
-          <w:szCs w:val="24"/>
-          <w:lang w:val="en-GB"/>
+          <w:rFonts w:ascii="Times New Roman" w:hAnsi="Times New Roman" w:eastAsia="Calibri" w:cs="Times New Roman" w:eastAsiaTheme="minorHAnsi"/>
+          <w:sz w:val="24"/>
+          <w:szCs w:val="24"/>
         </w:rPr>
         <w:t>matrix</w:t>
       </w:r>
       <w:r>
         <w:rPr>
-          <w:rFonts w:ascii="Times New Roman" w:hAnsi="Times New Roman" w:cs="Times New Roman"/>
-          <w:noProof/>
-          <w:sz w:val="24"/>
-          <w:szCs w:val="24"/>
-          <w:lang w:val="en-GB"/>
+          <w:rFonts w:ascii="Times New Roman" w:hAnsi="Times New Roman" w:eastAsia="Calibri" w:cs="Times New Roman" w:eastAsiaTheme="minorHAnsi"/>
+          <w:sz w:val="24"/>
+          <w:szCs w:val="24"/>
         </w:rPr>
         <w:t>.</w:t>
       </w:r>
@@ -1026,82 +861,67 @@
           <w:ilvl w:val="3"/>
           <w:numId w:val="3"/>
         </w:numPr>
-        <w:jc w:val="both"/>
-        <w:rPr>
-          <w:rFonts w:ascii="Times New Roman" w:hAnsi="Times New Roman" w:cs="Times New Roman"/>
-          <w:noProof/>
-          <w:sz w:val="24"/>
-          <w:szCs w:val="24"/>
-          <w:lang w:val="en-GB"/>
-        </w:rPr>
-      </w:pPr>
-      <w:r>
-        <w:rPr>
-          <w:rFonts w:ascii="Times New Roman" w:hAnsi="Times New Roman" w:cs="Times New Roman"/>
-          <w:noProof/>
-          <w:sz w:val="24"/>
-          <w:szCs w:val="24"/>
-          <w:lang w:val="en-GB"/>
+        <w:ind w:left="1440" w:hanging="360"/>
+        <w:jc w:val="both"/>
+        <w:rPr>
+          <w:rFonts w:ascii="Times New Roman" w:hAnsi="Times New Roman" w:cs="Times New Roman"/>
+          <w:sz w:val="24"/>
+          <w:szCs w:val="24"/>
+        </w:rPr>
+      </w:pPr>
+      <w:r>
+        <w:rPr>
+          <w:rFonts w:ascii="Times New Roman" w:hAnsi="Times New Roman" w:eastAsia="Calibri" w:cs="Times New Roman" w:eastAsiaTheme="minorHAnsi"/>
+          <w:sz w:val="24"/>
+          <w:szCs w:val="24"/>
         </w:rPr>
         <w:t xml:space="preserve">Find </w:t>
       </w:r>
       <w:r>
         <w:rPr>
-          <w:rFonts w:ascii="Times New Roman" w:hAnsi="Times New Roman" w:cs="Times New Roman"/>
-          <w:noProof/>
-          <w:sz w:val="24"/>
-          <w:szCs w:val="24"/>
-          <w:lang w:val="en-GB"/>
+          <w:rFonts w:ascii="Times New Roman" w:hAnsi="Times New Roman" w:eastAsia="Calibri" w:cs="Times New Roman" w:eastAsiaTheme="minorHAnsi"/>
+          <w:sz w:val="24"/>
+          <w:szCs w:val="24"/>
         </w:rPr>
         <w:t xml:space="preserve">the </w:t>
       </w:r>
       <w:r>
         <w:rPr>
-          <w:rFonts w:ascii="Times New Roman" w:hAnsi="Times New Roman" w:cs="Times New Roman"/>
-          <w:noProof/>
-          <w:sz w:val="24"/>
-          <w:szCs w:val="24"/>
-          <w:lang w:val="en-GB"/>
+          <w:rFonts w:ascii="Times New Roman" w:hAnsi="Times New Roman" w:eastAsia="Calibri" w:cs="Times New Roman" w:eastAsiaTheme="minorHAnsi"/>
+          <w:sz w:val="24"/>
+          <w:szCs w:val="24"/>
         </w:rPr>
         <w:t>maximum</w:t>
       </w:r>
       <w:r>
         <w:rPr>
-          <w:rFonts w:ascii="Times New Roman" w:hAnsi="Times New Roman" w:cs="Times New Roman"/>
-          <w:noProof/>
-          <w:sz w:val="24"/>
-          <w:szCs w:val="24"/>
-          <w:lang w:val="en-GB"/>
+          <w:rFonts w:ascii="Times New Roman" w:hAnsi="Times New Roman" w:eastAsia="Calibri" w:cs="Times New Roman" w:eastAsiaTheme="minorHAnsi"/>
+          <w:sz w:val="24"/>
+          <w:szCs w:val="24"/>
         </w:rPr>
         <w:t xml:space="preserve"> value</w:t>
       </w:r>
       <w:r>
         <w:rPr>
-          <w:rFonts w:ascii="Times New Roman" w:hAnsi="Times New Roman" w:cs="Times New Roman"/>
-          <w:noProof/>
-          <w:sz w:val="24"/>
-          <w:szCs w:val="24"/>
-          <w:lang w:val="en-GB"/>
+          <w:rFonts w:ascii="Times New Roman" w:hAnsi="Times New Roman" w:eastAsia="Calibri" w:cs="Times New Roman" w:eastAsiaTheme="minorHAnsi"/>
+          <w:sz w:val="24"/>
+          <w:szCs w:val="24"/>
         </w:rPr>
         <w:t xml:space="preserve"> in each column</w:t>
       </w:r>
       <w:r>
         <w:rPr>
-          <w:rFonts w:ascii="Times New Roman" w:hAnsi="Times New Roman" w:cs="Times New Roman"/>
-          <w:noProof/>
-          <w:sz w:val="24"/>
-          <w:szCs w:val="24"/>
-          <w:lang w:val="en-GB"/>
+          <w:rFonts w:ascii="Times New Roman" w:hAnsi="Times New Roman" w:eastAsia="Calibri" w:cs="Times New Roman" w:eastAsiaTheme="minorHAnsi"/>
+          <w:sz w:val="24"/>
+          <w:szCs w:val="24"/>
         </w:rPr>
         <w:t xml:space="preserve"> and in each row</w:t>
       </w:r>
       <w:r>
         <w:rPr>
-          <w:rFonts w:ascii="Times New Roman" w:hAnsi="Times New Roman" w:cs="Times New Roman"/>
-          <w:noProof/>
-          <w:sz w:val="24"/>
-          <w:szCs w:val="24"/>
-          <w:lang w:val="en-GB"/>
+          <w:rFonts w:ascii="Times New Roman" w:hAnsi="Times New Roman" w:eastAsia="Calibri" w:cs="Times New Roman" w:eastAsiaTheme="minorHAnsi"/>
+          <w:sz w:val="24"/>
+          <w:szCs w:val="24"/>
         </w:rPr>
         <w:t xml:space="preserve"> of the matrix.</w:t>
       </w:r>
@@ -1113,137 +933,54 @@
           <w:ilvl w:val="3"/>
           <w:numId w:val="3"/>
         </w:numPr>
-        <w:jc w:val="both"/>
-        <w:rPr>
-          <w:rFonts w:ascii="Times New Roman" w:hAnsi="Times New Roman" w:cs="Times New Roman"/>
-          <w:noProof/>
-          <w:sz w:val="24"/>
-          <w:szCs w:val="24"/>
-          <w:lang w:val="en-GB"/>
-        </w:rPr>
-      </w:pPr>
-      <w:r>
-        <w:rPr>
-          <w:rFonts w:ascii="Times New Roman" w:hAnsi="Times New Roman" w:cs="Times New Roman"/>
-          <w:noProof/>
-          <w:sz w:val="24"/>
-          <w:szCs w:val="24"/>
-          <w:lang w:val="en-GB"/>
+        <w:ind w:left="1440" w:hanging="360"/>
+        <w:jc w:val="both"/>
+        <w:rPr>
+          <w:rFonts w:ascii="Times New Roman" w:hAnsi="Times New Roman" w:cs="Times New Roman"/>
+          <w:sz w:val="24"/>
+          <w:szCs w:val="24"/>
+        </w:rPr>
+      </w:pPr>
+      <w:r>
+        <w:rPr>
+          <w:rFonts w:ascii="Times New Roman" w:hAnsi="Times New Roman" w:eastAsia="Calibri" w:cs="Times New Roman" w:eastAsiaTheme="minorHAnsi"/>
+          <w:sz w:val="24"/>
+          <w:szCs w:val="24"/>
         </w:rPr>
         <w:t xml:space="preserve">Find the </w:t>
       </w:r>
       <w:r>
         <w:rPr>
-          <w:rFonts w:ascii="Times New Roman" w:hAnsi="Times New Roman" w:cs="Times New Roman"/>
-          <w:noProof/>
-          <w:sz w:val="24"/>
-          <w:szCs w:val="24"/>
-          <w:lang w:val="en-GB"/>
+          <w:rFonts w:ascii="Times New Roman" w:hAnsi="Times New Roman" w:eastAsia="Calibri" w:cs="Times New Roman" w:eastAsiaTheme="minorHAnsi"/>
+          <w:sz w:val="24"/>
+          <w:szCs w:val="24"/>
         </w:rPr>
         <w:t xml:space="preserve">transpose </w:t>
       </w:r>
       <w:r>
         <w:rPr>
-          <w:rFonts w:ascii="Times New Roman" w:hAnsi="Times New Roman" w:cs="Times New Roman"/>
-          <w:noProof/>
-          <w:sz w:val="24"/>
-          <w:szCs w:val="24"/>
-          <w:lang w:val="en-GB"/>
+          <w:rFonts w:ascii="Times New Roman" w:hAnsi="Times New Roman" w:eastAsia="Calibri" w:cs="Times New Roman" w:eastAsiaTheme="minorHAnsi"/>
+          <w:sz w:val="24"/>
+          <w:szCs w:val="24"/>
         </w:rPr>
         <w:t>of the</w:t>
       </w:r>
       <w:r>
         <w:rPr>
-          <w:rFonts w:ascii="Times New Roman" w:hAnsi="Times New Roman" w:cs="Times New Roman"/>
-          <w:noProof/>
-          <w:sz w:val="24"/>
-          <w:szCs w:val="24"/>
-          <w:lang w:val="en-GB"/>
+          <w:rFonts w:ascii="Times New Roman" w:hAnsi="Times New Roman" w:eastAsia="Calibri" w:cs="Times New Roman" w:eastAsiaTheme="minorHAnsi"/>
+          <w:sz w:val="24"/>
+          <w:szCs w:val="24"/>
         </w:rPr>
         <w:t xml:space="preserve"> matrix</w:t>
       </w:r>
       <w:r>
         <w:rPr>
-          <w:rFonts w:ascii="Times New Roman" w:hAnsi="Times New Roman" w:cs="Times New Roman"/>
-          <w:noProof/>
-          <w:sz w:val="24"/>
-          <w:szCs w:val="24"/>
-          <w:lang w:val="en-GB"/>
+          <w:rFonts w:ascii="Times New Roman" w:hAnsi="Times New Roman" w:eastAsia="Calibri" w:cs="Times New Roman" w:eastAsiaTheme="minorHAnsi"/>
+          <w:sz w:val="24"/>
+          <w:szCs w:val="24"/>
         </w:rPr>
         <w:t>.</w:t>
       </w:r>
-    </w:p>
-    <w:p>
-      <w:pPr>
-        <w:pStyle w:val="ListParagraph"/>
-        <w:numPr>
-          <w:ilvl w:val="0"/>
-          <w:numId w:val="3"/>
-        </w:numPr>
-        <w:jc w:val="both"/>
-        <w:rPr>
-          <w:rFonts w:ascii="Times New Roman" w:hAnsi="Times New Roman" w:cs="Times New Roman"/>
-          <w:noProof/>
-          <w:vanish/>
-          <w:sz w:val="24"/>
-          <w:szCs w:val="24"/>
-          <w:lang w:val="en-GB"/>
-        </w:rPr>
-      </w:pPr>
-    </w:p>
-    <w:p>
-      <w:pPr>
-        <w:pStyle w:val="ListParagraph"/>
-        <w:numPr>
-          <w:ilvl w:val="0"/>
-          <w:numId w:val="3"/>
-        </w:numPr>
-        <w:jc w:val="both"/>
-        <w:rPr>
-          <w:rFonts w:ascii="Times New Roman" w:hAnsi="Times New Roman" w:cs="Times New Roman"/>
-          <w:noProof/>
-          <w:vanish/>
-          <w:sz w:val="24"/>
-          <w:szCs w:val="24"/>
-          <w:lang w:val="en-GB"/>
-        </w:rPr>
-      </w:pPr>
-    </w:p>
-    <w:p>
-      <w:pPr>
-        <w:pStyle w:val="ListParagraph"/>
-        <w:numPr>
-          <w:ilvl w:val="0"/>
-          <w:numId w:val="3"/>
-        </w:numPr>
-        <w:jc w:val="both"/>
-        <w:rPr>
-          <w:rFonts w:ascii="Times New Roman" w:hAnsi="Times New Roman" w:cs="Times New Roman"/>
-          <w:noProof/>
-          <w:vanish/>
-          <w:sz w:val="24"/>
-          <w:szCs w:val="24"/>
-          <w:lang w:val="en-GB"/>
-        </w:rPr>
-      </w:pPr>
-    </w:p>
-    <w:p>
-      <w:pPr>
-        <w:pStyle w:val="ListParagraph"/>
-        <w:numPr>
-          <w:ilvl w:val="0"/>
-          <w:numId w:val="3"/>
-        </w:numPr>
-        <w:jc w:val="both"/>
-        <w:rPr>
-          <w:rFonts w:ascii="Times New Roman" w:hAnsi="Times New Roman" w:cs="Times New Roman"/>
-          <w:noProof/>
-          <w:vanish/>
-          <w:sz w:val="24"/>
-          <w:szCs w:val="24"/>
-          <w:lang w:val="en-GB"/>
-        </w:rPr>
-      </w:pPr>
     </w:p>
     <w:p>
       <w:pPr>
@@ -1252,72 +989,59 @@
           <w:ilvl w:val="0"/>
           <w:numId w:val="1"/>
         </w:numPr>
-        <w:jc w:val="both"/>
-        <w:rPr>
-          <w:rFonts w:ascii="Times New Roman" w:hAnsi="Times New Roman" w:cs="Times New Roman"/>
-          <w:noProof/>
-          <w:sz w:val="24"/>
-          <w:szCs w:val="24"/>
-          <w:lang w:val="en-GB"/>
-        </w:rPr>
-      </w:pPr>
-      <w:r>
-        <w:rPr>
-          <w:rFonts w:ascii="Times New Roman" w:hAnsi="Times New Roman" w:cs="Times New Roman"/>
-          <w:noProof/>
-          <w:sz w:val="24"/>
-          <w:szCs w:val="24"/>
-          <w:lang w:val="en-GB"/>
+        <w:ind w:left="720" w:hanging="360"/>
+        <w:jc w:val="both"/>
+        <w:rPr>
+          <w:rFonts w:ascii="Times New Roman" w:hAnsi="Times New Roman" w:cs="Times New Roman"/>
+          <w:sz w:val="24"/>
+          <w:szCs w:val="24"/>
+        </w:rPr>
+      </w:pPr>
+      <w:r>
+        <w:rPr>
+          <w:rFonts w:ascii="Times New Roman" w:hAnsi="Times New Roman" w:eastAsia="Calibri" w:cs="Times New Roman" w:eastAsiaTheme="minorHAnsi"/>
+          <w:sz w:val="24"/>
+          <w:szCs w:val="24"/>
         </w:rPr>
         <w:t xml:space="preserve">Add </w:t>
       </w:r>
       <w:r>
         <w:rPr>
-          <w:rFonts w:ascii="Times New Roman" w:hAnsi="Times New Roman" w:cs="Times New Roman"/>
-          <w:noProof/>
-          <w:sz w:val="24"/>
-          <w:szCs w:val="24"/>
-          <w:lang w:val="en-GB"/>
+          <w:rFonts w:ascii="Times New Roman" w:hAnsi="Times New Roman" w:eastAsia="Calibri" w:cs="Times New Roman" w:eastAsiaTheme="minorHAnsi"/>
+          <w:sz w:val="24"/>
+          <w:szCs w:val="24"/>
         </w:rPr>
         <w:t>100</w:t>
       </w:r>
       <w:r>
         <w:rPr>
-          <w:rFonts w:ascii="Times New Roman" w:hAnsi="Times New Roman" w:cs="Times New Roman"/>
-          <w:noProof/>
-          <w:sz w:val="24"/>
-          <w:szCs w:val="24"/>
-          <w:lang w:val="en-GB"/>
+          <w:rFonts w:ascii="Times New Roman" w:hAnsi="Times New Roman" w:eastAsia="Calibri" w:cs="Times New Roman" w:eastAsiaTheme="minorHAnsi"/>
+          <w:sz w:val="24"/>
+          <w:szCs w:val="24"/>
         </w:rPr>
         <w:t xml:space="preserve"> to </w:t>
       </w:r>
       <w:r>
         <w:rPr>
-          <w:rFonts w:ascii="Times New Roman" w:hAnsi="Times New Roman" w:cs="Times New Roman"/>
-          <w:noProof/>
-          <w:sz w:val="24"/>
-          <w:szCs w:val="24"/>
-          <w:lang w:val="en-GB"/>
+          <w:rFonts w:ascii="Times New Roman" w:hAnsi="Times New Roman" w:eastAsia="Calibri" w:cs="Times New Roman" w:eastAsiaTheme="minorHAnsi"/>
+          <w:sz w:val="24"/>
+          <w:szCs w:val="24"/>
         </w:rPr>
         <w:t>each</w:t>
       </w:r>
       <w:r>
         <w:rPr>
-          <w:rFonts w:ascii="Times New Roman" w:hAnsi="Times New Roman" w:cs="Times New Roman"/>
-          <w:noProof/>
-          <w:sz w:val="24"/>
-          <w:szCs w:val="24"/>
-          <w:lang w:val="en-GB"/>
+          <w:rFonts w:ascii="Times New Roman" w:hAnsi="Times New Roman" w:eastAsia="Calibri" w:cs="Times New Roman" w:eastAsiaTheme="minorHAnsi"/>
+          <w:sz w:val="24"/>
+          <w:szCs w:val="24"/>
         </w:rPr>
         <w:t xml:space="preserve"> element of the following matrix </w:t>
       </w:r>
       <w:r>
         <w:rPr>
-          <w:rFonts w:ascii="Times New Roman" w:hAnsi="Times New Roman" w:cs="Times New Roman"/>
-          <w:noProof/>
-          <w:sz w:val="24"/>
-          <w:szCs w:val="24"/>
-          <w:lang w:val="en-GB"/>
+          <w:rFonts w:ascii="Times New Roman" w:hAnsi="Times New Roman" w:eastAsia="Calibri" w:cs="Times New Roman" w:eastAsiaTheme="minorHAnsi"/>
+          <w:sz w:val="24"/>
+          <w:szCs w:val="24"/>
         </w:rPr>
         <w:t xml:space="preserve">[[1, 2, 3], </w:t>
       </w:r>
@@ -1329,91 +1053,40 @@
         <w:jc w:val="both"/>
         <w:rPr>
           <w:rFonts w:ascii="Times New Roman" w:hAnsi="Times New Roman" w:cs="Times New Roman"/>
-          <w:noProof/>
-          <w:sz w:val="24"/>
-          <w:szCs w:val="24"/>
-          <w:lang w:val="en-GB"/>
-        </w:rPr>
-      </w:pPr>
-      <w:r>
-        <w:rPr>
-          <w:rFonts w:ascii="Times New Roman" w:hAnsi="Times New Roman" w:cs="Times New Roman"/>
-          <w:noProof/>
-          <w:sz w:val="24"/>
-          <w:szCs w:val="24"/>
-          <w:lang w:val="en-GB"/>
+          <w:sz w:val="24"/>
+          <w:szCs w:val="24"/>
+        </w:rPr>
+      </w:pPr>
+      <w:r>
+        <w:rPr>
+          <w:rFonts w:ascii="Times New Roman" w:hAnsi="Times New Roman" w:eastAsia="Calibri" w:cs="Times New Roman" w:eastAsiaTheme="minorHAnsi"/>
+          <w:sz w:val="24"/>
+          <w:szCs w:val="24"/>
         </w:rPr>
         <w:t xml:space="preserve">  </w:t>
       </w:r>
       <w:r>
-        <w:rPr>
-          <w:rFonts w:ascii="Times New Roman" w:hAnsi="Times New Roman" w:cs="Times New Roman"/>
-          <w:noProof/>
-          <w:sz w:val="24"/>
-          <w:szCs w:val="24"/>
-          <w:lang w:val="en-GB"/>
-        </w:rPr>
         <w:tab/>
       </w:r>
       <w:r>
-        <w:rPr>
-          <w:rFonts w:ascii="Times New Roman" w:hAnsi="Times New Roman" w:cs="Times New Roman"/>
-          <w:noProof/>
-          <w:sz w:val="24"/>
-          <w:szCs w:val="24"/>
-          <w:lang w:val="en-GB"/>
-        </w:rPr>
         <w:tab/>
       </w:r>
       <w:r>
-        <w:rPr>
-          <w:rFonts w:ascii="Times New Roman" w:hAnsi="Times New Roman" w:cs="Times New Roman"/>
-          <w:noProof/>
-          <w:sz w:val="24"/>
-          <w:szCs w:val="24"/>
-          <w:lang w:val="en-GB"/>
-        </w:rPr>
         <w:tab/>
       </w:r>
       <w:r>
-        <w:rPr>
-          <w:rFonts w:ascii="Times New Roman" w:hAnsi="Times New Roman" w:cs="Times New Roman"/>
-          <w:noProof/>
-          <w:sz w:val="24"/>
-          <w:szCs w:val="24"/>
-          <w:lang w:val="en-GB"/>
-        </w:rPr>
         <w:tab/>
       </w:r>
       <w:r>
-        <w:rPr>
-          <w:rFonts w:ascii="Times New Roman" w:hAnsi="Times New Roman" w:cs="Times New Roman"/>
-          <w:noProof/>
-          <w:sz w:val="24"/>
-          <w:szCs w:val="24"/>
-          <w:lang w:val="en-GB"/>
-        </w:rPr>
         <w:tab/>
       </w:r>
       <w:r>
         <w:rPr>
-          <w:rFonts w:ascii="Times New Roman" w:hAnsi="Times New Roman" w:cs="Times New Roman"/>
-          <w:noProof/>
-          <w:sz w:val="24"/>
-          <w:szCs w:val="24"/>
-          <w:lang w:val="en-GB"/>
-        </w:rPr>
-        <w:t xml:space="preserve">        </w:t>
-      </w:r>
-      <w:r>
-        <w:rPr>
-          <w:rFonts w:ascii="Times New Roman" w:hAnsi="Times New Roman" w:cs="Times New Roman"/>
-          <w:noProof/>
-          <w:sz w:val="24"/>
-          <w:szCs w:val="24"/>
-          <w:lang w:val="en-GB"/>
-        </w:rPr>
-        <w:t>[4, 5, 6],</w:t>
+          <w:rFonts w:ascii="Times New Roman" w:hAnsi="Times New Roman" w:eastAsia="Calibri" w:cs="Times New Roman" w:eastAsiaTheme="minorHAnsi"/>
+          <w:sz w:val="24"/>
+          <w:szCs w:val="24"/>
+        </w:rPr>
+        <w:t xml:space="preserve">        [4, 5, 6],</w:t>
       </w:r>
     </w:p>
     <w:p>
@@ -1423,91 +1096,40 @@
         <w:jc w:val="both"/>
         <w:rPr>
           <w:rFonts w:ascii="Times New Roman" w:hAnsi="Times New Roman" w:cs="Times New Roman"/>
-          <w:noProof/>
-          <w:sz w:val="24"/>
-          <w:szCs w:val="24"/>
-          <w:lang w:val="en-GB"/>
-        </w:rPr>
-      </w:pPr>
-      <w:r>
-        <w:rPr>
-          <w:rFonts w:ascii="Times New Roman" w:hAnsi="Times New Roman" w:cs="Times New Roman"/>
-          <w:noProof/>
-          <w:sz w:val="24"/>
-          <w:szCs w:val="24"/>
-          <w:lang w:val="en-GB"/>
+          <w:sz w:val="24"/>
+          <w:szCs w:val="24"/>
+        </w:rPr>
+      </w:pPr>
+      <w:r>
+        <w:rPr>
+          <w:rFonts w:ascii="Times New Roman" w:hAnsi="Times New Roman" w:eastAsia="Calibri" w:cs="Times New Roman" w:eastAsiaTheme="minorHAnsi"/>
+          <w:sz w:val="24"/>
+          <w:szCs w:val="24"/>
         </w:rPr>
         <w:t xml:space="preserve">  </w:t>
       </w:r>
       <w:r>
-        <w:rPr>
-          <w:rFonts w:ascii="Times New Roman" w:hAnsi="Times New Roman" w:cs="Times New Roman"/>
-          <w:noProof/>
-          <w:sz w:val="24"/>
-          <w:szCs w:val="24"/>
-          <w:lang w:val="en-GB"/>
-        </w:rPr>
         <w:tab/>
       </w:r>
       <w:r>
-        <w:rPr>
-          <w:rFonts w:ascii="Times New Roman" w:hAnsi="Times New Roman" w:cs="Times New Roman"/>
-          <w:noProof/>
-          <w:sz w:val="24"/>
-          <w:szCs w:val="24"/>
-          <w:lang w:val="en-GB"/>
-        </w:rPr>
         <w:tab/>
       </w:r>
       <w:r>
-        <w:rPr>
-          <w:rFonts w:ascii="Times New Roman" w:hAnsi="Times New Roman" w:cs="Times New Roman"/>
-          <w:noProof/>
-          <w:sz w:val="24"/>
-          <w:szCs w:val="24"/>
-          <w:lang w:val="en-GB"/>
-        </w:rPr>
         <w:tab/>
       </w:r>
       <w:r>
-        <w:rPr>
-          <w:rFonts w:ascii="Times New Roman" w:hAnsi="Times New Roman" w:cs="Times New Roman"/>
-          <w:noProof/>
-          <w:sz w:val="24"/>
-          <w:szCs w:val="24"/>
-          <w:lang w:val="en-GB"/>
-        </w:rPr>
         <w:tab/>
       </w:r>
       <w:r>
-        <w:rPr>
-          <w:rFonts w:ascii="Times New Roman" w:hAnsi="Times New Roman" w:cs="Times New Roman"/>
-          <w:noProof/>
-          <w:sz w:val="24"/>
-          <w:szCs w:val="24"/>
-          <w:lang w:val="en-GB"/>
-        </w:rPr>
         <w:tab/>
       </w:r>
       <w:r>
         <w:rPr>
-          <w:rFonts w:ascii="Times New Roman" w:hAnsi="Times New Roman" w:cs="Times New Roman"/>
-          <w:noProof/>
-          <w:sz w:val="24"/>
-          <w:szCs w:val="24"/>
-          <w:lang w:val="en-GB"/>
-        </w:rPr>
-        <w:t xml:space="preserve">        </w:t>
-      </w:r>
-      <w:r>
-        <w:rPr>
-          <w:rFonts w:ascii="Times New Roman" w:hAnsi="Times New Roman" w:cs="Times New Roman"/>
-          <w:noProof/>
-          <w:sz w:val="24"/>
-          <w:szCs w:val="24"/>
-          <w:lang w:val="en-GB"/>
-        </w:rPr>
-        <w:t>[7, 8, 9]]</w:t>
+          <w:rFonts w:ascii="Times New Roman" w:hAnsi="Times New Roman" w:eastAsia="Calibri" w:cs="Times New Roman" w:eastAsiaTheme="minorHAnsi"/>
+          <w:sz w:val="24"/>
+          <w:szCs w:val="24"/>
+        </w:rPr>
+        <w:t xml:space="preserve">        [7, 8, 9]]</w:t>
       </w:r>
     </w:p>
     <w:p>
@@ -1517,42 +1139,35 @@
           <w:ilvl w:val="1"/>
           <w:numId w:val="5"/>
         </w:numPr>
-        <w:jc w:val="both"/>
-        <w:rPr>
-          <w:rFonts w:ascii="Times New Roman" w:hAnsi="Times New Roman" w:cs="Times New Roman"/>
-          <w:noProof/>
-          <w:sz w:val="24"/>
-          <w:szCs w:val="24"/>
-          <w:lang w:val="en-GB"/>
-        </w:rPr>
-      </w:pPr>
-      <w:r>
-        <w:rPr>
-          <w:rFonts w:ascii="Times New Roman" w:hAnsi="Times New Roman" w:cs="Times New Roman"/>
-          <w:noProof/>
-          <w:sz w:val="24"/>
-          <w:szCs w:val="24"/>
-          <w:lang w:val="en-GB"/>
+        <w:ind w:left="720" w:hanging="360"/>
+        <w:jc w:val="both"/>
+        <w:rPr>
+          <w:rFonts w:ascii="Times New Roman" w:hAnsi="Times New Roman" w:cs="Times New Roman"/>
+          <w:sz w:val="24"/>
+          <w:szCs w:val="24"/>
+        </w:rPr>
+      </w:pPr>
+      <w:r>
+        <w:rPr>
+          <w:rFonts w:ascii="Times New Roman" w:hAnsi="Times New Roman" w:eastAsia="Calibri" w:cs="Times New Roman" w:eastAsiaTheme="minorHAnsi"/>
+          <w:sz w:val="24"/>
+          <w:szCs w:val="24"/>
         </w:rPr>
         <w:t xml:space="preserve">Reshape the below matrix </w:t>
       </w:r>
       <w:r>
         <w:rPr>
-          <w:rFonts w:ascii="Times New Roman" w:hAnsi="Times New Roman" w:cs="Times New Roman"/>
-          <w:noProof/>
-          <w:sz w:val="24"/>
-          <w:szCs w:val="24"/>
-          <w:lang w:val="en-GB"/>
+          <w:rFonts w:ascii="Times New Roman" w:hAnsi="Times New Roman" w:eastAsia="Calibri" w:cs="Times New Roman" w:eastAsiaTheme="minorHAnsi"/>
+          <w:sz w:val="24"/>
+          <w:szCs w:val="24"/>
         </w:rPr>
         <w:t>into 2x6 matrix</w:t>
       </w:r>
       <w:r>
         <w:rPr>
-          <w:rFonts w:ascii="Times New Roman" w:hAnsi="Times New Roman" w:cs="Times New Roman"/>
-          <w:noProof/>
-          <w:sz w:val="24"/>
-          <w:szCs w:val="24"/>
-          <w:lang w:val="en-GB"/>
+          <w:rFonts w:ascii="Times New Roman" w:hAnsi="Times New Roman" w:eastAsia="Calibri" w:cs="Times New Roman" w:eastAsiaTheme="minorHAnsi"/>
+          <w:sz w:val="24"/>
+          <w:szCs w:val="24"/>
         </w:rPr>
         <w:t xml:space="preserve">: </w:t>
       </w:r>
@@ -1564,39 +1179,31 @@
         <w:jc w:val="both"/>
         <w:rPr>
           <w:rFonts w:ascii="Times New Roman" w:hAnsi="Times New Roman" w:cs="Times New Roman"/>
-          <w:noProof/>
-          <w:sz w:val="24"/>
-          <w:szCs w:val="24"/>
-          <w:lang w:val="en-GB"/>
-        </w:rPr>
-      </w:pPr>
-      <w:r>
-        <w:rPr>
-          <w:rFonts w:ascii="Times New Roman" w:hAnsi="Times New Roman" w:cs="Times New Roman"/>
-          <w:noProof/>
-          <w:sz w:val="24"/>
-          <w:szCs w:val="24"/>
-          <w:lang w:val="en-GB"/>
+          <w:sz w:val="24"/>
+          <w:szCs w:val="24"/>
+        </w:rPr>
+      </w:pPr>
+      <w:r>
+        <w:rPr>
+          <w:rFonts w:ascii="Times New Roman" w:hAnsi="Times New Roman" w:eastAsia="Calibri" w:cs="Times New Roman" w:eastAsiaTheme="minorHAnsi"/>
+          <w:sz w:val="24"/>
+          <w:szCs w:val="24"/>
         </w:rPr>
         <w:t>[[</w:t>
       </w:r>
       <w:r>
         <w:rPr>
-          <w:rFonts w:ascii="Times New Roman" w:hAnsi="Times New Roman" w:cs="Times New Roman"/>
-          <w:noProof/>
-          <w:sz w:val="24"/>
-          <w:szCs w:val="24"/>
-          <w:lang w:val="en-GB"/>
+          <w:rFonts w:ascii="Times New Roman" w:hAnsi="Times New Roman" w:eastAsia="Calibri" w:cs="Times New Roman" w:eastAsiaTheme="minorHAnsi"/>
+          <w:sz w:val="24"/>
+          <w:szCs w:val="24"/>
         </w:rPr>
         <w:t>1, 2, 3]</w:t>
       </w:r>
       <w:r>
         <w:rPr>
-          <w:rFonts w:ascii="Times New Roman" w:hAnsi="Times New Roman" w:cs="Times New Roman"/>
-          <w:noProof/>
-          <w:sz w:val="24"/>
-          <w:szCs w:val="24"/>
-          <w:lang w:val="en-GB"/>
+          <w:rFonts w:ascii="Times New Roman" w:hAnsi="Times New Roman" w:eastAsia="Calibri" w:cs="Times New Roman" w:eastAsiaTheme="minorHAnsi"/>
+          <w:sz w:val="24"/>
+          <w:szCs w:val="24"/>
         </w:rPr>
         <w:t>,</w:t>
       </w:r>
@@ -1607,39 +1214,26 @@
         <w:jc w:val="both"/>
         <w:rPr>
           <w:rFonts w:ascii="Times New Roman" w:hAnsi="Times New Roman" w:cs="Times New Roman"/>
-          <w:noProof/>
-          <w:sz w:val="24"/>
-          <w:szCs w:val="24"/>
-          <w:lang w:val="en-GB"/>
-        </w:rPr>
-      </w:pPr>
-      <w:r>
-        <w:rPr>
-          <w:rFonts w:ascii="Times New Roman" w:hAnsi="Times New Roman" w:cs="Times New Roman"/>
-          <w:noProof/>
-          <w:sz w:val="24"/>
-          <w:szCs w:val="24"/>
-          <w:lang w:val="en-GB"/>
+          <w:sz w:val="24"/>
+          <w:szCs w:val="24"/>
+        </w:rPr>
+      </w:pPr>
+      <w:r>
+        <w:rPr>
+          <w:rFonts w:ascii="Times New Roman" w:hAnsi="Times New Roman" w:eastAsia="Calibri" w:cs="Times New Roman" w:eastAsiaTheme="minorHAnsi"/>
+          <w:sz w:val="24"/>
+          <w:szCs w:val="24"/>
         </w:rPr>
         <w:t xml:space="preserve"> </w:t>
       </w:r>
       <w:r>
-        <w:rPr>
-          <w:rFonts w:ascii="Times New Roman" w:hAnsi="Times New Roman" w:cs="Times New Roman"/>
-          <w:noProof/>
-          <w:sz w:val="24"/>
-          <w:szCs w:val="24"/>
-          <w:lang w:val="en-GB"/>
-        </w:rPr>
         <w:tab/>
       </w:r>
       <w:r>
         <w:rPr>
-          <w:rFonts w:ascii="Times New Roman" w:hAnsi="Times New Roman" w:cs="Times New Roman"/>
-          <w:noProof/>
-          <w:sz w:val="24"/>
-          <w:szCs w:val="24"/>
-          <w:lang w:val="en-GB"/>
+          <w:rFonts w:ascii="Times New Roman" w:hAnsi="Times New Roman" w:eastAsia="Calibri" w:cs="Times New Roman" w:eastAsiaTheme="minorHAnsi"/>
+          <w:sz w:val="24"/>
+          <w:szCs w:val="24"/>
         </w:rPr>
         <w:t xml:space="preserve"> [4, 5, 6],</w:t>
       </w:r>
@@ -1651,29 +1245,23 @@
         <w:jc w:val="both"/>
         <w:rPr>
           <w:rFonts w:ascii="Times New Roman" w:hAnsi="Times New Roman" w:cs="Times New Roman"/>
-          <w:noProof/>
-          <w:sz w:val="24"/>
-          <w:szCs w:val="24"/>
-          <w:lang w:val="en-GB"/>
-        </w:rPr>
-      </w:pPr>
-      <w:r>
-        <w:rPr>
-          <w:rFonts w:ascii="Times New Roman" w:hAnsi="Times New Roman" w:cs="Times New Roman"/>
-          <w:noProof/>
-          <w:sz w:val="24"/>
-          <w:szCs w:val="24"/>
-          <w:lang w:val="en-GB"/>
+          <w:sz w:val="24"/>
+          <w:szCs w:val="24"/>
+        </w:rPr>
+      </w:pPr>
+      <w:r>
+        <w:rPr>
+          <w:rFonts w:ascii="Times New Roman" w:hAnsi="Times New Roman" w:eastAsia="Calibri" w:cs="Times New Roman" w:eastAsiaTheme="minorHAnsi"/>
+          <w:sz w:val="24"/>
+          <w:szCs w:val="24"/>
         </w:rPr>
         <w:t xml:space="preserve"> </w:t>
       </w:r>
       <w:r>
         <w:rPr>
-          <w:rFonts w:ascii="Times New Roman" w:hAnsi="Times New Roman" w:cs="Times New Roman"/>
-          <w:noProof/>
-          <w:sz w:val="24"/>
-          <w:szCs w:val="24"/>
-          <w:lang w:val="en-GB"/>
+          <w:rFonts w:ascii="Times New Roman" w:hAnsi="Times New Roman" w:eastAsia="Calibri" w:cs="Times New Roman" w:eastAsiaTheme="minorHAnsi"/>
+          <w:sz w:val="24"/>
+          <w:szCs w:val="24"/>
         </w:rPr>
         <w:t>[7, 8, 9],</w:t>
       </w:r>
@@ -1684,39 +1272,26 @@
         <w:jc w:val="both"/>
         <w:rPr>
           <w:rFonts w:ascii="Times New Roman" w:hAnsi="Times New Roman" w:cs="Times New Roman"/>
-          <w:noProof/>
-          <w:sz w:val="24"/>
-          <w:szCs w:val="24"/>
-          <w:lang w:val="en-GB"/>
-        </w:rPr>
-      </w:pPr>
-      <w:r>
-        <w:rPr>
-          <w:rFonts w:ascii="Times New Roman" w:hAnsi="Times New Roman" w:cs="Times New Roman"/>
-          <w:noProof/>
-          <w:sz w:val="24"/>
-          <w:szCs w:val="24"/>
-          <w:lang w:val="en-GB"/>
+          <w:sz w:val="24"/>
+          <w:szCs w:val="24"/>
+        </w:rPr>
+      </w:pPr>
+      <w:r>
+        <w:rPr>
+          <w:rFonts w:ascii="Times New Roman" w:hAnsi="Times New Roman" w:eastAsia="Calibri" w:cs="Times New Roman" w:eastAsiaTheme="minorHAnsi"/>
+          <w:sz w:val="24"/>
+          <w:szCs w:val="24"/>
         </w:rPr>
         <w:t xml:space="preserve"> </w:t>
       </w:r>
       <w:r>
-        <w:rPr>
-          <w:rFonts w:ascii="Times New Roman" w:hAnsi="Times New Roman" w:cs="Times New Roman"/>
-          <w:noProof/>
-          <w:sz w:val="24"/>
-          <w:szCs w:val="24"/>
-          <w:lang w:val="en-GB"/>
-        </w:rPr>
         <w:tab/>
       </w:r>
       <w:r>
         <w:rPr>
-          <w:rFonts w:ascii="Times New Roman" w:hAnsi="Times New Roman" w:cs="Times New Roman"/>
-          <w:noProof/>
-          <w:sz w:val="24"/>
-          <w:szCs w:val="24"/>
-          <w:lang w:val="en-GB"/>
+          <w:rFonts w:ascii="Times New Roman" w:hAnsi="Times New Roman" w:eastAsia="Calibri" w:cs="Times New Roman" w:eastAsiaTheme="minorHAnsi"/>
+          <w:sz w:val="24"/>
+          <w:szCs w:val="24"/>
         </w:rPr>
         <w:t xml:space="preserve"> [10, 11, 12]]</w:t>
       </w:r>
@@ -1728,32 +1303,27 @@
           <w:ilvl w:val="1"/>
           <w:numId w:val="5"/>
         </w:numPr>
-        <w:jc w:val="both"/>
-        <w:rPr>
-          <w:rFonts w:ascii="Times New Roman" w:hAnsi="Times New Roman" w:cs="Times New Roman"/>
-          <w:noProof/>
-          <w:sz w:val="24"/>
-          <w:szCs w:val="24"/>
-          <w:lang w:val="en-GB"/>
-        </w:rPr>
-      </w:pPr>
-      <w:r>
-        <w:rPr>
-          <w:rFonts w:ascii="Times New Roman" w:hAnsi="Times New Roman" w:cs="Times New Roman"/>
-          <w:noProof/>
-          <w:sz w:val="24"/>
-          <w:szCs w:val="24"/>
-          <w:lang w:val="en-GB"/>
+        <w:ind w:left="720" w:hanging="360"/>
+        <w:jc w:val="both"/>
+        <w:rPr>
+          <w:rFonts w:ascii="Times New Roman" w:hAnsi="Times New Roman" w:cs="Times New Roman"/>
+          <w:sz w:val="24"/>
+          <w:szCs w:val="24"/>
+        </w:rPr>
+      </w:pPr>
+      <w:r>
+        <w:rPr>
+          <w:rFonts w:ascii="Times New Roman" w:hAnsi="Times New Roman" w:eastAsia="Calibri" w:cs="Times New Roman" w:eastAsiaTheme="minorHAnsi"/>
+          <w:sz w:val="24"/>
+          <w:szCs w:val="24"/>
         </w:rPr>
         <w:t>Generate three random floats between 0.0 and 1.0</w:t>
       </w:r>
       <w:r>
         <w:rPr>
-          <w:rFonts w:ascii="Times New Roman" w:hAnsi="Times New Roman" w:cs="Times New Roman"/>
-          <w:noProof/>
-          <w:sz w:val="24"/>
-          <w:szCs w:val="24"/>
-          <w:lang w:val="en-GB"/>
+          <w:rFonts w:ascii="Times New Roman" w:hAnsi="Times New Roman" w:eastAsia="Calibri" w:cs="Times New Roman" w:eastAsiaTheme="minorHAnsi"/>
+          <w:sz w:val="24"/>
+          <w:szCs w:val="24"/>
         </w:rPr>
         <w:t xml:space="preserve">. </w:t>
       </w:r>
@@ -1765,32 +1335,27 @@
           <w:ilvl w:val="1"/>
           <w:numId w:val="5"/>
         </w:numPr>
-        <w:jc w:val="both"/>
-        <w:rPr>
-          <w:rFonts w:ascii="Times New Roman" w:hAnsi="Times New Roman" w:cs="Times New Roman"/>
-          <w:noProof/>
-          <w:sz w:val="24"/>
-          <w:szCs w:val="24"/>
-          <w:lang w:val="en-GB"/>
-        </w:rPr>
-      </w:pPr>
-      <w:r>
-        <w:rPr>
-          <w:rFonts w:ascii="Times New Roman" w:hAnsi="Times New Roman" w:cs="Times New Roman"/>
-          <w:noProof/>
-          <w:sz w:val="24"/>
-          <w:szCs w:val="24"/>
-          <w:lang w:val="en-GB"/>
+        <w:ind w:left="720" w:hanging="360"/>
+        <w:jc w:val="both"/>
+        <w:rPr>
+          <w:rFonts w:ascii="Times New Roman" w:hAnsi="Times New Roman" w:cs="Times New Roman"/>
+          <w:sz w:val="24"/>
+          <w:szCs w:val="24"/>
+        </w:rPr>
+      </w:pPr>
+      <w:r>
+        <w:rPr>
+          <w:rFonts w:ascii="Times New Roman" w:hAnsi="Times New Roman" w:eastAsia="Calibri" w:cs="Times New Roman" w:eastAsiaTheme="minorHAnsi"/>
+          <w:sz w:val="24"/>
+          <w:szCs w:val="24"/>
         </w:rPr>
         <w:t>Generate three random integers between 1 and 10</w:t>
       </w:r>
       <w:r>
         <w:rPr>
-          <w:rFonts w:ascii="Times New Roman" w:hAnsi="Times New Roman" w:cs="Times New Roman"/>
-          <w:noProof/>
-          <w:sz w:val="24"/>
-          <w:szCs w:val="24"/>
-          <w:lang w:val="en-GB"/>
+          <w:rFonts w:ascii="Times New Roman" w:hAnsi="Times New Roman" w:eastAsia="Calibri" w:cs="Times New Roman" w:eastAsiaTheme="minorHAnsi"/>
+          <w:sz w:val="24"/>
+          <w:szCs w:val="24"/>
         </w:rPr>
         <w:t>.</w:t>
       </w:r>
@@ -1802,32 +1367,27 @@
           <w:ilvl w:val="1"/>
           <w:numId w:val="5"/>
         </w:numPr>
-        <w:jc w:val="both"/>
-        <w:rPr>
-          <w:rFonts w:ascii="Times New Roman" w:hAnsi="Times New Roman" w:cs="Times New Roman"/>
-          <w:noProof/>
-          <w:sz w:val="24"/>
-          <w:szCs w:val="24"/>
-          <w:lang w:val="en-GB"/>
-        </w:rPr>
-      </w:pPr>
-      <w:r>
-        <w:rPr>
-          <w:rFonts w:ascii="Times New Roman" w:hAnsi="Times New Roman" w:cs="Times New Roman"/>
-          <w:noProof/>
-          <w:sz w:val="24"/>
-          <w:szCs w:val="24"/>
-          <w:lang w:val="en-GB"/>
+        <w:ind w:left="720" w:hanging="360"/>
+        <w:jc w:val="both"/>
+        <w:rPr>
+          <w:rFonts w:ascii="Times New Roman" w:hAnsi="Times New Roman" w:cs="Times New Roman"/>
+          <w:sz w:val="24"/>
+          <w:szCs w:val="24"/>
+        </w:rPr>
+      </w:pPr>
+      <w:r>
+        <w:rPr>
+          <w:rFonts w:ascii="Times New Roman" w:hAnsi="Times New Roman" w:eastAsia="Calibri" w:cs="Times New Roman" w:eastAsiaTheme="minorHAnsi"/>
+          <w:sz w:val="24"/>
+          <w:szCs w:val="24"/>
         </w:rPr>
         <w:t>Draw three numbers from a normal distribution with mean 0.0 and standard deviation of 1.0</w:t>
       </w:r>
       <w:r>
         <w:rPr>
-          <w:rFonts w:ascii="Times New Roman" w:hAnsi="Times New Roman" w:cs="Times New Roman"/>
-          <w:noProof/>
-          <w:sz w:val="24"/>
-          <w:szCs w:val="24"/>
-          <w:lang w:val="en-GB"/>
+          <w:rFonts w:ascii="Times New Roman" w:hAnsi="Times New Roman" w:eastAsia="Calibri" w:cs="Times New Roman" w:eastAsiaTheme="minorHAnsi"/>
+          <w:sz w:val="24"/>
+          <w:szCs w:val="24"/>
         </w:rPr>
         <w:t>.</w:t>
       </w:r>
@@ -1839,22 +1399,19 @@
           <w:ilvl w:val="1"/>
           <w:numId w:val="5"/>
         </w:numPr>
-        <w:jc w:val="both"/>
-        <w:rPr>
-          <w:rFonts w:ascii="Times New Roman" w:hAnsi="Times New Roman" w:cs="Times New Roman"/>
-          <w:noProof/>
-          <w:sz w:val="24"/>
-          <w:szCs w:val="24"/>
-          <w:lang w:val="en-GB"/>
-        </w:rPr>
-      </w:pPr>
-      <w:r>
-        <w:rPr>
-          <w:rFonts w:ascii="Times New Roman" w:hAnsi="Times New Roman" w:cs="Times New Roman"/>
-          <w:noProof/>
-          <w:sz w:val="24"/>
-          <w:szCs w:val="24"/>
-          <w:lang w:val="en-GB"/>
+        <w:ind w:left="720" w:hanging="360"/>
+        <w:jc w:val="both"/>
+        <w:rPr>
+          <w:rFonts w:ascii="Times New Roman" w:hAnsi="Times New Roman" w:cs="Times New Roman"/>
+          <w:sz w:val="24"/>
+          <w:szCs w:val="24"/>
+        </w:rPr>
+      </w:pPr>
+      <w:r>
+        <w:rPr>
+          <w:rFonts w:ascii="Times New Roman" w:hAnsi="Times New Roman" w:eastAsia="Calibri" w:cs="Times New Roman" w:eastAsiaTheme="minorHAnsi"/>
+          <w:sz w:val="24"/>
+          <w:szCs w:val="24"/>
         </w:rPr>
         <w:t>Create a matrix and apply the following operations on:</w:t>
       </w:r>
@@ -1866,88 +1423,73 @@
           <w:ilvl w:val="0"/>
           <w:numId w:val="6"/>
         </w:numPr>
-        <w:jc w:val="both"/>
-        <w:rPr>
-          <w:rFonts w:ascii="Times New Roman" w:hAnsi="Times New Roman" w:cs="Times New Roman"/>
-          <w:noProof/>
-          <w:sz w:val="24"/>
-          <w:szCs w:val="24"/>
-          <w:lang w:val="en-GB"/>
-        </w:rPr>
-      </w:pPr>
-      <w:r>
-        <w:rPr>
-          <w:rFonts w:ascii="Times New Roman" w:hAnsi="Times New Roman" w:cs="Times New Roman"/>
-          <w:noProof/>
-          <w:sz w:val="24"/>
-          <w:szCs w:val="24"/>
-          <w:lang w:val="en-GB"/>
+        <w:ind w:left="1080" w:hanging="360"/>
+        <w:jc w:val="both"/>
+        <w:rPr>
+          <w:rFonts w:ascii="Times New Roman" w:hAnsi="Times New Roman" w:cs="Times New Roman"/>
+          <w:sz w:val="24"/>
+          <w:szCs w:val="24"/>
+        </w:rPr>
+      </w:pPr>
+      <w:r>
+        <w:rPr>
+          <w:rFonts w:ascii="Times New Roman" w:hAnsi="Times New Roman" w:eastAsia="Calibri" w:cs="Times New Roman" w:eastAsiaTheme="minorHAnsi"/>
+          <w:sz w:val="24"/>
+          <w:szCs w:val="24"/>
         </w:rPr>
         <w:t xml:space="preserve">Create a matrix called </w:t>
       </w:r>
       <w:r>
         <w:rPr>
-          <w:rFonts w:ascii="Times New Roman" w:hAnsi="Times New Roman" w:cs="Times New Roman"/>
+          <w:rFonts w:ascii="Times New Roman" w:hAnsi="Times New Roman" w:eastAsia="Calibri" w:cs="Times New Roman" w:eastAsiaTheme="minorHAnsi"/>
           <w:b/>
           <w:bCs/>
-          <w:noProof/>
-          <w:sz w:val="24"/>
-          <w:szCs w:val="24"/>
-          <w:lang w:val="en-GB"/>
+          <w:sz w:val="24"/>
+          <w:szCs w:val="24"/>
         </w:rPr>
         <w:t>weather_matrix</w:t>
       </w:r>
       <w:r>
         <w:rPr>
-          <w:rFonts w:ascii="Times New Roman" w:hAnsi="Times New Roman" w:cs="Times New Roman"/>
-          <w:noProof/>
-          <w:sz w:val="24"/>
-          <w:szCs w:val="24"/>
-          <w:lang w:val="en-GB"/>
+          <w:rFonts w:ascii="Times New Roman" w:hAnsi="Times New Roman" w:eastAsia="Calibri" w:cs="Times New Roman" w:eastAsiaTheme="minorHAnsi"/>
+          <w:sz w:val="24"/>
+          <w:szCs w:val="24"/>
         </w:rPr>
         <w:t xml:space="preserve"> by using </w:t>
       </w:r>
       <w:r>
         <w:rPr>
-          <w:rFonts w:ascii="Times New Roman" w:hAnsi="Times New Roman" w:cs="Times New Roman"/>
+          <w:rFonts w:ascii="Times New Roman" w:hAnsi="Times New Roman" w:eastAsia="Calibri" w:cs="Times New Roman" w:eastAsiaTheme="minorHAnsi"/>
           <w:i/>
           <w:iCs/>
-          <w:noProof/>
-          <w:sz w:val="24"/>
-          <w:szCs w:val="24"/>
-          <w:lang w:val="en-GB"/>
+          <w:sz w:val="24"/>
+          <w:szCs w:val="24"/>
         </w:rPr>
         <w:t>linspace()</w:t>
       </w:r>
       <w:r>
         <w:rPr>
-          <w:rFonts w:ascii="Times New Roman" w:hAnsi="Times New Roman" w:cs="Times New Roman"/>
-          <w:noProof/>
-          <w:sz w:val="24"/>
-          <w:szCs w:val="24"/>
-          <w:lang w:val="en-GB"/>
+          <w:rFonts w:ascii="Times New Roman" w:hAnsi="Times New Roman" w:eastAsia="Calibri" w:cs="Times New Roman" w:eastAsiaTheme="minorHAnsi"/>
+          <w:sz w:val="24"/>
+          <w:szCs w:val="24"/>
         </w:rPr>
         <w:t xml:space="preserve"> command that creates 15 numbers from 5 to 30 with equal intervals. </w:t>
       </w:r>
       <w:r>
         <w:rPr>
-          <w:rFonts w:ascii="Times New Roman" w:hAnsi="Times New Roman" w:cs="Times New Roman"/>
+          <w:rFonts w:ascii="Times New Roman" w:hAnsi="Times New Roman" w:eastAsia="Calibri" w:cs="Times New Roman" w:eastAsiaTheme="minorHAnsi"/>
           <w:b/>
           <w:bCs/>
-          <w:noProof/>
-          <w:sz w:val="24"/>
-          <w:szCs w:val="24"/>
-          <w:lang w:val="en-GB"/>
+          <w:sz w:val="24"/>
+          <w:szCs w:val="24"/>
         </w:rPr>
         <w:t>weather_matrix</w:t>
       </w:r>
       <w:r>
         <w:rPr>
-          <w:rFonts w:ascii="Times New Roman" w:hAnsi="Times New Roman" w:cs="Times New Roman"/>
-          <w:noProof/>
-          <w:sz w:val="24"/>
-          <w:szCs w:val="24"/>
-          <w:lang w:val="en-GB"/>
+          <w:rFonts w:ascii="Times New Roman" w:hAnsi="Times New Roman" w:eastAsia="Calibri" w:cs="Times New Roman" w:eastAsiaTheme="minorHAnsi"/>
+          <w:sz w:val="24"/>
+          <w:szCs w:val="24"/>
         </w:rPr>
         <w:t xml:space="preserve"> should contain 5 rows and 3 columns, fill the matrix by rows.</w:t>
       </w:r>
@@ -1959,33 +1501,28 @@
           <w:ilvl w:val="0"/>
           <w:numId w:val="6"/>
         </w:numPr>
-        <w:jc w:val="both"/>
-        <w:rPr>
-          <w:rFonts w:ascii="Times New Roman" w:hAnsi="Times New Roman" w:cs="Times New Roman"/>
-          <w:noProof/>
-          <w:sz w:val="24"/>
-          <w:szCs w:val="24"/>
-          <w:lang w:val="en-GB"/>
-        </w:rPr>
-      </w:pPr>
-      <w:r>
-        <w:rPr>
-          <w:rFonts w:ascii="Times New Roman" w:hAnsi="Times New Roman" w:cs="Times New Roman"/>
-          <w:noProof/>
-          <w:sz w:val="24"/>
-          <w:szCs w:val="24"/>
-          <w:lang w:val="en-GB"/>
-        </w:rPr>
+        <w:ind w:left="1080" w:hanging="360"/>
+        <w:jc w:val="both"/>
+        <w:rPr>
+          <w:rFonts w:ascii="Times New Roman" w:hAnsi="Times New Roman" w:cs="Times New Roman"/>
+          <w:sz w:val="24"/>
+          <w:szCs w:val="24"/>
+        </w:rPr>
+      </w:pPr>
+      <w:r>
         <w:lastRenderedPageBreak/>
+        <w:rPr>
+          <w:rFonts w:ascii="Times New Roman" w:hAnsi="Times New Roman" w:eastAsia="Calibri" w:cs="Times New Roman" w:eastAsiaTheme="minorHAnsi"/>
+          <w:sz w:val="24"/>
+          <w:szCs w:val="24"/>
+        </w:rPr>
         <w:t>Set the row (day1, day2, day3, day4, day5) and column (s1, s2, s3) names of weather_matrix</w:t>
       </w:r>
       <w:r>
         <w:rPr>
-          <w:rFonts w:ascii="Times New Roman" w:hAnsi="Times New Roman" w:cs="Times New Roman"/>
-          <w:noProof/>
-          <w:sz w:val="24"/>
-          <w:szCs w:val="24"/>
-          <w:lang w:val="en-GB"/>
+          <w:rFonts w:ascii="Times New Roman" w:hAnsi="Times New Roman" w:eastAsia="Calibri" w:cs="Times New Roman" w:eastAsiaTheme="minorHAnsi"/>
+          <w:sz w:val="24"/>
+          <w:szCs w:val="24"/>
         </w:rPr>
         <w:t>.</w:t>
       </w:r>
@@ -1997,62 +1534,51 @@
           <w:ilvl w:val="0"/>
           <w:numId w:val="6"/>
         </w:numPr>
-        <w:jc w:val="both"/>
-        <w:rPr>
-          <w:rFonts w:ascii="Times New Roman" w:hAnsi="Times New Roman" w:cs="Times New Roman"/>
-          <w:noProof/>
-          <w:sz w:val="24"/>
-          <w:szCs w:val="24"/>
-          <w:lang w:val="en-GB"/>
-        </w:rPr>
-      </w:pPr>
-      <w:r>
-        <w:rPr>
-          <w:rFonts w:ascii="Times New Roman" w:hAnsi="Times New Roman" w:cs="Times New Roman"/>
-          <w:noProof/>
-          <w:sz w:val="24"/>
-          <w:szCs w:val="24"/>
-          <w:lang w:val="en-GB"/>
+        <w:ind w:left="1080" w:hanging="360"/>
+        <w:jc w:val="both"/>
+        <w:rPr>
+          <w:rFonts w:ascii="Times New Roman" w:hAnsi="Times New Roman" w:cs="Times New Roman"/>
+          <w:sz w:val="24"/>
+          <w:szCs w:val="24"/>
+        </w:rPr>
+      </w:pPr>
+      <w:r>
+        <w:rPr>
+          <w:rFonts w:ascii="Times New Roman" w:hAnsi="Times New Roman" w:eastAsia="Calibri" w:cs="Times New Roman" w:eastAsiaTheme="minorHAnsi"/>
+          <w:sz w:val="24"/>
+          <w:szCs w:val="24"/>
         </w:rPr>
         <w:t xml:space="preserve">Compute the summation of samples (rowSums) and </w:t>
       </w:r>
       <w:r>
         <w:rPr>
-          <w:rFonts w:ascii="Times New Roman" w:hAnsi="Times New Roman" w:cs="Times New Roman"/>
-          <w:noProof/>
-          <w:sz w:val="24"/>
-          <w:szCs w:val="24"/>
-          <w:lang w:val="en-GB"/>
+          <w:rFonts w:ascii="Times New Roman" w:hAnsi="Times New Roman" w:eastAsia="Calibri" w:cs="Times New Roman" w:eastAsiaTheme="minorHAnsi"/>
+          <w:sz w:val="24"/>
+          <w:szCs w:val="24"/>
         </w:rPr>
         <w:t>determine</w:t>
       </w:r>
       <w:r>
         <w:rPr>
-          <w:rFonts w:ascii="Times New Roman" w:hAnsi="Times New Roman" w:cs="Times New Roman"/>
-          <w:noProof/>
-          <w:sz w:val="24"/>
-          <w:szCs w:val="24"/>
-          <w:lang w:val="en-GB"/>
+          <w:rFonts w:ascii="Times New Roman" w:hAnsi="Times New Roman" w:eastAsia="Calibri" w:cs="Times New Roman" w:eastAsiaTheme="minorHAnsi"/>
+          <w:sz w:val="24"/>
+          <w:szCs w:val="24"/>
         </w:rPr>
         <w:t xml:space="preserve"> which day has the highest </w:t>
       </w:r>
       <w:r>
         <w:rPr>
-          <w:rFonts w:ascii="Times New Roman" w:hAnsi="Times New Roman" w:cs="Times New Roman"/>
-          <w:noProof/>
-          <w:sz w:val="24"/>
-          <w:szCs w:val="24"/>
-          <w:lang w:val="en-GB"/>
+          <w:rFonts w:ascii="Times New Roman" w:hAnsi="Times New Roman" w:eastAsia="Calibri" w:cs="Times New Roman" w:eastAsiaTheme="minorHAnsi"/>
+          <w:sz w:val="24"/>
+          <w:szCs w:val="24"/>
         </w:rPr>
         <w:t>total</w:t>
       </w:r>
       <w:r>
         <w:rPr>
-          <w:rFonts w:ascii="Times New Roman" w:hAnsi="Times New Roman" w:cs="Times New Roman"/>
-          <w:noProof/>
-          <w:sz w:val="24"/>
-          <w:szCs w:val="24"/>
-          <w:lang w:val="en-GB"/>
+          <w:rFonts w:ascii="Times New Roman" w:hAnsi="Times New Roman" w:eastAsia="Calibri" w:cs="Times New Roman" w:eastAsiaTheme="minorHAnsi"/>
+          <w:sz w:val="24"/>
+          <w:szCs w:val="24"/>
         </w:rPr>
         <w:t xml:space="preserve"> temperature.</w:t>
       </w:r>
@@ -2064,44 +1590,37 @@
           <w:ilvl w:val="0"/>
           <w:numId w:val="6"/>
         </w:numPr>
-        <w:jc w:val="both"/>
-        <w:rPr>
-          <w:rFonts w:ascii="Times New Roman" w:hAnsi="Times New Roman" w:cs="Times New Roman"/>
-          <w:noProof/>
-          <w:sz w:val="24"/>
-          <w:szCs w:val="24"/>
-          <w:lang w:val="en-GB"/>
-        </w:rPr>
-      </w:pPr>
-      <w:r>
-        <w:rPr>
-          <w:rFonts w:ascii="Times New Roman" w:hAnsi="Times New Roman" w:cs="Times New Roman"/>
-          <w:noProof/>
-          <w:sz w:val="24"/>
-          <w:szCs w:val="24"/>
-          <w:lang w:val="en-GB"/>
+        <w:ind w:left="1080" w:hanging="360"/>
+        <w:jc w:val="both"/>
+        <w:rPr>
+          <w:rFonts w:ascii="Times New Roman" w:hAnsi="Times New Roman" w:cs="Times New Roman"/>
+          <w:sz w:val="24"/>
+          <w:szCs w:val="24"/>
+        </w:rPr>
+      </w:pPr>
+      <w:r>
+        <w:rPr>
+          <w:rFonts w:ascii="Times New Roman" w:hAnsi="Times New Roman" w:eastAsia="Calibri" w:cs="Times New Roman" w:eastAsiaTheme="minorHAnsi"/>
+          <w:sz w:val="24"/>
+          <w:szCs w:val="24"/>
         </w:rPr>
         <w:t xml:space="preserve">Choose day4 and day5 and their s2 and s3 samples, save them in a </w:t>
       </w:r>
       <w:r>
         <w:rPr>
-          <w:rFonts w:ascii="Times New Roman" w:hAnsi="Times New Roman" w:cs="Times New Roman"/>
+          <w:rFonts w:ascii="Times New Roman" w:hAnsi="Times New Roman" w:eastAsia="Calibri" w:cs="Times New Roman" w:eastAsiaTheme="minorHAnsi"/>
           <w:b/>
           <w:bCs/>
-          <w:noProof/>
-          <w:sz w:val="24"/>
-          <w:szCs w:val="24"/>
-          <w:lang w:val="en-GB"/>
+          <w:sz w:val="24"/>
+          <w:szCs w:val="24"/>
         </w:rPr>
         <w:t>subB</w:t>
       </w:r>
       <w:r>
         <w:rPr>
-          <w:rFonts w:ascii="Times New Roman" w:hAnsi="Times New Roman" w:cs="Times New Roman"/>
-          <w:noProof/>
-          <w:sz w:val="24"/>
-          <w:szCs w:val="24"/>
-          <w:lang w:val="en-GB"/>
+          <w:rFonts w:ascii="Times New Roman" w:hAnsi="Times New Roman" w:eastAsia="Calibri" w:cs="Times New Roman" w:eastAsiaTheme="minorHAnsi"/>
+          <w:sz w:val="24"/>
+          <w:szCs w:val="24"/>
         </w:rPr>
         <w:t xml:space="preserve"> object. </w:t>
       </w:r>
@@ -2113,10 +1632,8 @@
         <w:jc w:val="both"/>
         <w:rPr>
           <w:rFonts w:ascii="Times New Roman" w:hAnsi="Times New Roman" w:cs="Times New Roman"/>
-          <w:noProof/>
-          <w:sz w:val="24"/>
-          <w:szCs w:val="24"/>
-          <w:lang w:val="en-GB"/>
+          <w:sz w:val="24"/>
+          <w:szCs w:val="24"/>
         </w:rPr>
       </w:pPr>
     </w:p>
@@ -2127,280 +1644,227 @@
           <w:ilvl w:val="1"/>
           <w:numId w:val="5"/>
         </w:numPr>
-        <w:jc w:val="both"/>
-        <w:rPr>
-          <w:rFonts w:ascii="Times New Roman" w:hAnsi="Times New Roman" w:cs="Times New Roman"/>
-          <w:noProof/>
-          <w:sz w:val="24"/>
-          <w:szCs w:val="24"/>
-          <w:lang w:val="en-GB"/>
-        </w:rPr>
-      </w:pPr>
-      <w:r>
-        <w:rPr>
-          <w:rFonts w:ascii="Times New Roman" w:hAnsi="Times New Roman" w:cs="Times New Roman"/>
-          <w:noProof/>
-          <w:sz w:val="24"/>
-          <w:szCs w:val="24"/>
-          <w:lang w:val="en-GB"/>
+        <w:ind w:left="720" w:hanging="360"/>
+        <w:jc w:val="both"/>
+        <w:rPr>
+          <w:rFonts w:ascii="Times New Roman" w:hAnsi="Times New Roman" w:cs="Times New Roman"/>
+          <w:sz w:val="24"/>
+          <w:szCs w:val="24"/>
+        </w:rPr>
+      </w:pPr>
+      <w:r>
+        <w:rPr>
+          <w:rFonts w:ascii="Times New Roman" w:hAnsi="Times New Roman" w:eastAsia="Calibri" w:cs="Times New Roman" w:eastAsiaTheme="minorHAnsi"/>
+          <w:sz w:val="24"/>
+          <w:szCs w:val="24"/>
         </w:rPr>
         <w:t xml:space="preserve">Create </w:t>
       </w:r>
       <w:r>
         <w:rPr>
-          <w:rFonts w:ascii="Times New Roman" w:hAnsi="Times New Roman" w:cs="Times New Roman"/>
-          <w:noProof/>
-          <w:sz w:val="24"/>
-          <w:szCs w:val="24"/>
-          <w:lang w:val="en-GB"/>
+          <w:rFonts w:ascii="Times New Roman" w:hAnsi="Times New Roman" w:eastAsia="Calibri" w:cs="Times New Roman" w:eastAsiaTheme="minorHAnsi"/>
+          <w:sz w:val="24"/>
+          <w:szCs w:val="24"/>
         </w:rPr>
         <w:t>three</w:t>
       </w:r>
       <w:r>
         <w:rPr>
-          <w:rFonts w:ascii="Times New Roman" w:hAnsi="Times New Roman" w:cs="Times New Roman"/>
-          <w:noProof/>
-          <w:sz w:val="24"/>
-          <w:szCs w:val="24"/>
-          <w:lang w:val="en-GB"/>
+          <w:rFonts w:ascii="Times New Roman" w:hAnsi="Times New Roman" w:eastAsia="Calibri" w:cs="Times New Roman" w:eastAsiaTheme="minorHAnsi"/>
+          <w:sz w:val="24"/>
+          <w:szCs w:val="24"/>
         </w:rPr>
         <w:t xml:space="preserve"> </w:t>
       </w:r>
       <w:r>
         <w:rPr>
-          <w:rFonts w:ascii="Times New Roman" w:hAnsi="Times New Roman" w:cs="Times New Roman"/>
-          <w:noProof/>
-          <w:sz w:val="24"/>
-          <w:szCs w:val="24"/>
-          <w:lang w:val="en-GB"/>
+          <w:rFonts w:ascii="Times New Roman" w:hAnsi="Times New Roman" w:eastAsia="Calibri" w:cs="Times New Roman" w:eastAsiaTheme="minorHAnsi"/>
+          <w:sz w:val="24"/>
+          <w:szCs w:val="24"/>
         </w:rPr>
         <w:t>lists</w:t>
       </w:r>
       <w:r>
         <w:rPr>
-          <w:rFonts w:ascii="Times New Roman" w:hAnsi="Times New Roman" w:cs="Times New Roman"/>
-          <w:noProof/>
-          <w:sz w:val="24"/>
-          <w:szCs w:val="24"/>
-          <w:lang w:val="en-GB"/>
+          <w:rFonts w:ascii="Times New Roman" w:hAnsi="Times New Roman" w:eastAsia="Calibri" w:cs="Times New Roman" w:eastAsiaTheme="minorHAnsi"/>
+          <w:sz w:val="24"/>
+          <w:szCs w:val="24"/>
         </w:rPr>
         <w:t xml:space="preserve">: </w:t>
       </w:r>
       <w:r>
         <w:rPr>
-          <w:rFonts w:ascii="Times New Roman" w:hAnsi="Times New Roman" w:cs="Times New Roman"/>
+          <w:rFonts w:ascii="Times New Roman" w:hAnsi="Times New Roman" w:eastAsia="Calibri" w:cs="Times New Roman" w:eastAsiaTheme="minorHAnsi"/>
           <w:b/>
           <w:bCs/>
-          <w:noProof/>
-          <w:sz w:val="24"/>
-          <w:szCs w:val="24"/>
-          <w:lang w:val="en-GB"/>
+          <w:sz w:val="24"/>
+          <w:szCs w:val="24"/>
         </w:rPr>
         <w:t>name</w:t>
       </w:r>
       <w:r>
         <w:rPr>
-          <w:rFonts w:ascii="Times New Roman" w:hAnsi="Times New Roman" w:cs="Times New Roman"/>
-          <w:noProof/>
-          <w:sz w:val="24"/>
-          <w:szCs w:val="24"/>
-          <w:lang w:val="en-GB"/>
+          <w:rFonts w:ascii="Times New Roman" w:hAnsi="Times New Roman" w:eastAsia="Calibri" w:cs="Times New Roman" w:eastAsiaTheme="minorHAnsi"/>
+          <w:sz w:val="24"/>
+          <w:szCs w:val="24"/>
         </w:rPr>
         <w:t xml:space="preserve"> ("Ali","Cenk","Mete"), </w:t>
       </w:r>
       <w:r>
         <w:rPr>
-          <w:rFonts w:ascii="Times New Roman" w:hAnsi="Times New Roman" w:cs="Times New Roman"/>
+          <w:rFonts w:ascii="Times New Roman" w:hAnsi="Times New Roman" w:eastAsia="Calibri" w:cs="Times New Roman" w:eastAsiaTheme="minorHAnsi"/>
           <w:b/>
           <w:bCs/>
-          <w:noProof/>
-          <w:sz w:val="24"/>
-          <w:szCs w:val="24"/>
-          <w:lang w:val="en-GB"/>
+          <w:sz w:val="24"/>
+          <w:szCs w:val="24"/>
         </w:rPr>
         <w:t>age</w:t>
       </w:r>
       <w:r>
         <w:rPr>
-          <w:rFonts w:ascii="Times New Roman" w:hAnsi="Times New Roman" w:cs="Times New Roman"/>
-          <w:noProof/>
-          <w:sz w:val="24"/>
-          <w:szCs w:val="24"/>
-          <w:lang w:val="en-GB"/>
+          <w:rFonts w:ascii="Times New Roman" w:hAnsi="Times New Roman" w:eastAsia="Calibri" w:cs="Times New Roman" w:eastAsiaTheme="minorHAnsi"/>
+          <w:sz w:val="24"/>
+          <w:szCs w:val="24"/>
         </w:rPr>
         <w:t xml:space="preserve"> (26,32,29), </w:t>
       </w:r>
       <w:r>
         <w:rPr>
-          <w:rFonts w:ascii="Times New Roman" w:hAnsi="Times New Roman" w:cs="Times New Roman"/>
+          <w:rFonts w:ascii="Times New Roman" w:hAnsi="Times New Roman" w:eastAsia="Calibri" w:cs="Times New Roman" w:eastAsiaTheme="minorHAnsi"/>
           <w:b/>
           <w:bCs/>
-          <w:noProof/>
-          <w:sz w:val="24"/>
-          <w:szCs w:val="24"/>
-          <w:lang w:val="en-GB"/>
+          <w:sz w:val="24"/>
+          <w:szCs w:val="24"/>
         </w:rPr>
         <w:t>salary</w:t>
       </w:r>
       <w:r>
         <w:rPr>
-          <w:rFonts w:ascii="Times New Roman" w:hAnsi="Times New Roman" w:cs="Times New Roman"/>
-          <w:noProof/>
-          <w:sz w:val="24"/>
-          <w:szCs w:val="24"/>
-          <w:lang w:val="en-GB"/>
+          <w:rFonts w:ascii="Times New Roman" w:hAnsi="Times New Roman" w:eastAsia="Calibri" w:cs="Times New Roman" w:eastAsiaTheme="minorHAnsi"/>
+          <w:sz w:val="24"/>
+          <w:szCs w:val="24"/>
         </w:rPr>
         <w:t xml:space="preserve"> </w:t>
       </w:r>
       <w:r>
         <w:rPr>
-          <w:rFonts w:ascii="Times New Roman" w:hAnsi="Times New Roman" w:cs="Times New Roman"/>
-          <w:noProof/>
-          <w:sz w:val="24"/>
-          <w:szCs w:val="24"/>
-          <w:lang w:val="en-GB"/>
+          <w:rFonts w:ascii="Times New Roman" w:hAnsi="Times New Roman" w:eastAsia="Calibri" w:cs="Times New Roman" w:eastAsiaTheme="minorHAnsi"/>
+          <w:sz w:val="24"/>
+          <w:szCs w:val="24"/>
         </w:rPr>
         <w:t xml:space="preserve">(2700, </w:t>
       </w:r>
       <w:r>
         <w:rPr>
-          <w:rFonts w:ascii="Times New Roman" w:hAnsi="Times New Roman" w:cs="Times New Roman"/>
-          <w:noProof/>
-          <w:sz w:val="24"/>
-          <w:szCs w:val="24"/>
-          <w:lang w:val="en-GB"/>
+          <w:rFonts w:ascii="Times New Roman" w:hAnsi="Times New Roman" w:eastAsia="Calibri" w:cs="Times New Roman" w:eastAsiaTheme="minorHAnsi"/>
+          <w:sz w:val="24"/>
+          <w:szCs w:val="24"/>
         </w:rPr>
         <w:t>4900</w:t>
       </w:r>
       <w:r>
         <w:rPr>
-          <w:rFonts w:ascii="Times New Roman" w:hAnsi="Times New Roman" w:cs="Times New Roman"/>
-          <w:noProof/>
-          <w:sz w:val="24"/>
-          <w:szCs w:val="24"/>
-          <w:lang w:val="en-GB"/>
+          <w:rFonts w:ascii="Times New Roman" w:hAnsi="Times New Roman" w:eastAsia="Calibri" w:cs="Times New Roman" w:eastAsiaTheme="minorHAnsi"/>
+          <w:sz w:val="24"/>
+          <w:szCs w:val="24"/>
         </w:rPr>
         <w:t xml:space="preserve">, </w:t>
       </w:r>
       <w:r>
         <w:rPr>
-          <w:rFonts w:ascii="Times New Roman" w:hAnsi="Times New Roman" w:cs="Times New Roman"/>
-          <w:noProof/>
-          <w:sz w:val="24"/>
-          <w:szCs w:val="24"/>
-          <w:lang w:val="en-GB"/>
+          <w:rFonts w:ascii="Times New Roman" w:hAnsi="Times New Roman" w:eastAsia="Calibri" w:cs="Times New Roman" w:eastAsiaTheme="minorHAnsi"/>
+          <w:sz w:val="24"/>
+          <w:szCs w:val="24"/>
         </w:rPr>
         <w:t>3200</w:t>
       </w:r>
       <w:r>
         <w:rPr>
-          <w:rFonts w:ascii="Times New Roman" w:hAnsi="Times New Roman" w:cs="Times New Roman"/>
-          <w:noProof/>
-          <w:sz w:val="24"/>
-          <w:szCs w:val="24"/>
-          <w:lang w:val="en-GB"/>
+          <w:rFonts w:ascii="Times New Roman" w:hAnsi="Times New Roman" w:eastAsia="Calibri" w:cs="Times New Roman" w:eastAsiaTheme="minorHAnsi"/>
+          <w:sz w:val="24"/>
+          <w:szCs w:val="24"/>
         </w:rPr>
         <w:t xml:space="preserve">). </w:t>
       </w:r>
       <w:r>
         <w:rPr>
-          <w:rFonts w:ascii="Times New Roman" w:hAnsi="Times New Roman" w:cs="Times New Roman"/>
-          <w:noProof/>
-          <w:sz w:val="24"/>
-          <w:szCs w:val="24"/>
-          <w:lang w:val="en-GB"/>
+          <w:rFonts w:ascii="Times New Roman" w:hAnsi="Times New Roman" w:eastAsia="Calibri" w:cs="Times New Roman" w:eastAsiaTheme="minorHAnsi"/>
+          <w:sz w:val="24"/>
+          <w:szCs w:val="24"/>
         </w:rPr>
         <w:t>C</w:t>
       </w:r>
       <w:r>
         <w:rPr>
-          <w:rFonts w:ascii="Times New Roman" w:hAnsi="Times New Roman" w:cs="Times New Roman"/>
-          <w:noProof/>
-          <w:sz w:val="24"/>
-          <w:szCs w:val="24"/>
-          <w:lang w:val="en-GB"/>
+          <w:rFonts w:ascii="Times New Roman" w:hAnsi="Times New Roman" w:eastAsia="Calibri" w:cs="Times New Roman" w:eastAsiaTheme="minorHAnsi"/>
+          <w:sz w:val="24"/>
+          <w:szCs w:val="24"/>
         </w:rPr>
         <w:t xml:space="preserve">ombine these </w:t>
       </w:r>
       <w:r>
         <w:rPr>
-          <w:rFonts w:ascii="Times New Roman" w:hAnsi="Times New Roman" w:cs="Times New Roman"/>
-          <w:noProof/>
-          <w:sz w:val="24"/>
-          <w:szCs w:val="24"/>
-          <w:lang w:val="en-GB"/>
+          <w:rFonts w:ascii="Times New Roman" w:hAnsi="Times New Roman" w:eastAsia="Calibri" w:cs="Times New Roman" w:eastAsiaTheme="minorHAnsi"/>
+          <w:sz w:val="24"/>
+          <w:szCs w:val="24"/>
         </w:rPr>
         <w:t>lists into</w:t>
       </w:r>
       <w:r>
         <w:rPr>
-          <w:rFonts w:ascii="Times New Roman" w:hAnsi="Times New Roman" w:cs="Times New Roman"/>
-          <w:noProof/>
-          <w:sz w:val="24"/>
-          <w:szCs w:val="24"/>
-          <w:lang w:val="en-GB"/>
+          <w:rFonts w:ascii="Times New Roman" w:hAnsi="Times New Roman" w:eastAsia="Calibri" w:cs="Times New Roman" w:eastAsiaTheme="minorHAnsi"/>
+          <w:sz w:val="24"/>
+          <w:szCs w:val="24"/>
         </w:rPr>
         <w:t xml:space="preserve"> </w:t>
       </w:r>
       <w:r>
         <w:rPr>
-          <w:rFonts w:ascii="Times New Roman" w:hAnsi="Times New Roman" w:cs="Times New Roman"/>
-          <w:noProof/>
-          <w:sz w:val="24"/>
-          <w:szCs w:val="24"/>
-          <w:lang w:val="en-GB"/>
+          <w:rFonts w:ascii="Times New Roman" w:hAnsi="Times New Roman" w:eastAsia="Calibri" w:cs="Times New Roman" w:eastAsiaTheme="minorHAnsi"/>
+          <w:sz w:val="24"/>
+          <w:szCs w:val="24"/>
         </w:rPr>
         <w:t>a pandas DataFrame named</w:t>
       </w:r>
       <w:r>
         <w:rPr>
-          <w:rFonts w:ascii="Times New Roman" w:hAnsi="Times New Roman" w:cs="Times New Roman"/>
-          <w:noProof/>
-          <w:sz w:val="24"/>
-          <w:szCs w:val="24"/>
-          <w:lang w:val="en-GB"/>
+          <w:rFonts w:ascii="Times New Roman" w:hAnsi="Times New Roman" w:eastAsia="Calibri" w:cs="Times New Roman" w:eastAsiaTheme="minorHAnsi"/>
+          <w:sz w:val="24"/>
+          <w:szCs w:val="24"/>
         </w:rPr>
         <w:t xml:space="preserve"> </w:t>
       </w:r>
       <w:r>
         <w:rPr>
-          <w:rFonts w:ascii="Times New Roman" w:hAnsi="Times New Roman" w:cs="Times New Roman"/>
+          <w:rFonts w:ascii="Times New Roman" w:hAnsi="Times New Roman" w:eastAsia="Calibri" w:cs="Times New Roman" w:eastAsiaTheme="minorHAnsi"/>
           <w:b/>
           <w:bCs/>
-          <w:noProof/>
-          <w:sz w:val="24"/>
-          <w:szCs w:val="24"/>
-          <w:lang w:val="en-GB"/>
+          <w:sz w:val="24"/>
+          <w:szCs w:val="24"/>
         </w:rPr>
         <w:t>company</w:t>
       </w:r>
       <w:r>
         <w:rPr>
-          <w:rFonts w:ascii="Times New Roman" w:hAnsi="Times New Roman" w:cs="Times New Roman"/>
-          <w:noProof/>
-          <w:sz w:val="24"/>
-          <w:szCs w:val="24"/>
-          <w:lang w:val="en-GB"/>
+          <w:rFonts w:ascii="Times New Roman" w:hAnsi="Times New Roman" w:eastAsia="Calibri" w:cs="Times New Roman" w:eastAsiaTheme="minorHAnsi"/>
+          <w:sz w:val="24"/>
+          <w:szCs w:val="24"/>
         </w:rPr>
         <w:t xml:space="preserve">. Find the name of the employee </w:t>
       </w:r>
       <w:r>
         <w:rPr>
-          <w:rFonts w:ascii="Times New Roman" w:hAnsi="Times New Roman" w:cs="Times New Roman"/>
-          <w:noProof/>
-          <w:sz w:val="24"/>
-          <w:szCs w:val="24"/>
-          <w:lang w:val="en-GB"/>
+          <w:rFonts w:ascii="Times New Roman" w:hAnsi="Times New Roman" w:eastAsia="Calibri" w:cs="Times New Roman" w:eastAsiaTheme="minorHAnsi"/>
+          <w:sz w:val="24"/>
+          <w:szCs w:val="24"/>
         </w:rPr>
         <w:t>with the highest salary using a loop</w:t>
       </w:r>
       <w:r>
         <w:rPr>
-          <w:rFonts w:ascii="Times New Roman" w:hAnsi="Times New Roman" w:cs="Times New Roman"/>
-          <w:noProof/>
-          <w:sz w:val="24"/>
-          <w:szCs w:val="24"/>
-          <w:lang w:val="en-GB"/>
+          <w:rFonts w:ascii="Times New Roman" w:hAnsi="Times New Roman" w:eastAsia="Calibri" w:cs="Times New Roman" w:eastAsiaTheme="minorHAnsi"/>
+          <w:sz w:val="24"/>
+          <w:szCs w:val="24"/>
         </w:rPr>
         <w:t xml:space="preserve">. </w:t>
       </w:r>
@@ -2411,17 +1875,14 @@
         <w:jc w:val="both"/>
         <w:rPr>
           <w:rFonts w:ascii="Times New Roman" w:hAnsi="Times New Roman" w:cs="Times New Roman"/>
-          <w:noProof/>
-          <w:sz w:val="24"/>
-          <w:szCs w:val="24"/>
-          <w:lang w:val="en-GB"/>
+          <w:sz w:val="24"/>
+          <w:szCs w:val="24"/>
         </w:rPr>
       </w:pPr>
     </w:p>
     <w:sectPr>
       <w:pgSz w:w="11906" w:h="16838"/>
       <w:pgMar w:top="1417" w:right="1417" w:bottom="1417" w:left="1417" w:header="708" w:footer="708" w:gutter="0"/>
-      <w:cols w:space="708"/>
       <w:docGrid w:linePitch="360"/>
     </w:sectPr>
   </w:body>

</xml_diff>